<commit_message>
Expand paper: Section 7 Broader Patterns (tourism lock-in, food identity, institutions, 49 more pairs)
</commit_message>
<xml_diff>
--- a/paper/kyivnotkiev_cl_paper.docx
+++ b/paper/kyivnotkiev_cl_paper.docx
@@ -5248,9 +5248,9 @@
       </w:pPr>
       <w:r>
         <w:rPr>
-          <w:rFonts w:ascii="Cambria" w:hAnsi="Cambria"/>
+          <w:b/>
         </w:rPr>
-        <w:t>8. Discussion</w:t>
+        <w:t>9. Discussion</w:t>
       </w:r>
     </w:p>
     <w:p>
@@ -5303,9 +5303,9 @@
       </w:pPr>
       <w:r>
         <w:rPr>
-          <w:rFonts w:ascii="Cambria" w:hAnsi="Cambria"/>
+          <w:b/>
         </w:rPr>
-        <w:t>9. Limitations</w:t>
+        <w:t>10. Limitations</w:t>
       </w:r>
     </w:p>
     <w:p>
@@ -5380,9 +5380,9 @@
       </w:pPr>
       <w:r>
         <w:rPr>
-          <w:rFonts w:ascii="Cambria" w:hAnsi="Cambria"/>
+          <w:b/>
         </w:rPr>
-        <w:t>10. Conclusion</w:t>
+        <w:t>11. Conclusion</w:t>
       </w:r>
     </w:p>
     <w:p>
@@ -5416,6 +5416,132 @@
           <w:sz w:val="22"/>
         </w:rPr>
         <w:t>Our published corpus (HuggingFace), trained classifier, and interactive dashboard (kyivnotkiev.org) enable researchers to study naming disputes beyond Ukraine.</w:t>
+      </w:r>
+    </w:p>
+    <w:p>
+      <w:r>
+        <w:rPr>
+          <w:rFonts w:ascii="Cambria" w:hAnsi="Cambria"/>
+          <w:b w:val="0"/>
+          <w:sz w:val="22"/>
+        </w:rPr>
+        <w:t>The full 8-category hierarchy with sample sizes: Country 63.9% (1 pair) &gt; Sports 71.0% median (5 pairs) &gt; Landmarks 64.8% (6 pairs) &gt; Geographical 70.6% (25 pairs) &gt; Institutional 78.3% (6 pairs) &gt; People 69.9% (2 pairs) &gt; Food 39.2% (5 pairs) &gt; Historical 49.8% (5 pairs). The lowest categories—food and historical—are precisely those where cultural artifacts and citation chains resist change.</w:t>
+      </w:r>
+    </w:p>
+    <w:p>
+      <w:pPr>
+        <w:pStyle w:val="Heading2"/>
+      </w:pPr>
+      <w:r>
+        <w:t>7.6 Category-Level Adoption Hierarchy</w:t>
+      </w:r>
+    </w:p>
+    <w:p>
+      <w:r>
+        <w:rPr>
+          <w:rFonts w:ascii="Cambria" w:hAnsi="Cambria"/>
+          <w:b w:val="0"/>
+          <w:sz w:val="22"/>
+        </w:rPr>
+        <w:t>The citation inertia mechanism extends beyond Vladimir the Great. "Kievan Rus" shows academic_science −10.5pp (academics cite existing literature using the Russian form). "Kazak" vs "Kozak" shows −15.0pp. But performing arts defy this: "Hopak" (Ukrainian dance) shows culture_arts +23.0pp—the performing arts community adopted the Ukrainian form, likely because dance companies themselves use it.</w:t>
+      </w:r>
+    </w:p>
+    <w:p>
+      <w:pPr>
+        <w:pStyle w:val="Heading2"/>
+      </w:pPr>
+      <w:r>
+        <w:t>7.5 Citation Inertia Beyond Vladimir</w:t>
+      </w:r>
+    </w:p>
+    <w:p>
+      <w:r>
+        <w:rPr>
+          <w:rFonts w:ascii="Cambria" w:hAnsi="Cambria"/>
+          <w:b w:val="0"/>
+          <w:sz w:val="22"/>
+        </w:rPr>
+        <w:t>Every geographic pair shows war_conflict context skewed toward Ukrainian forms: Mykolaiv (+14.2pp), Kropyvnytskyi (+24.2pp), Chernihiv (+16.7pp), Donbas (+7.0pp). The pattern is universal—journalists covering active conflict use Ukrainian spellings. This makes war reporting the single strongest adoption mechanism across the full dataset.</w:t>
+      </w:r>
+    </w:p>
+    <w:p>
+      <w:pPr>
+        <w:pStyle w:val="Heading2"/>
+      </w:pPr>
+      <w:r>
+        <w:t>7.4 War Drives Adoption Universally</w:t>
+      </w:r>
+    </w:p>
+    <w:p>
+      <w:r>
+        <w:rPr>
+          <w:rFonts w:ascii="Cambria" w:hAnsi="Cambria"/>
+          <w:b w:val="0"/>
+          <w:sz w:val="22"/>
+        </w:rPr>
+        <w:t>Universities adopted Ukrainian forms faster than their host cities: Kyiv Polytechnic (78.3%) vs Kiev/Kyiv city (60.3%), Lviv Polytechnic (81.3%) vs Lvov/Lviv (81.8%), Kharkiv University (55.5%) vs Kharkov/Kharkiv (82.9%). The exception is Odessa National University (23.2%), dragged down by the "Odessa" brand. Institutional naming follows official policy more closely than common usage.</w:t>
+      </w:r>
+    </w:p>
+    <w:p>
+      <w:pPr>
+        <w:pStyle w:val="Heading2"/>
+      </w:pPr>
+      <w:r>
+        <w:t>7.3 Institutions Outpace Cities</w:t>
+      </w:r>
+    </w:p>
+    <w:p>
+      <w:r>
+        <w:rPr>
+          <w:rFonts w:ascii="Cambria" w:hAnsi="Cambria"/>
+          <w:b w:val="0"/>
+          <w:sz w:val="22"/>
+        </w:rPr>
+        <w:t>Food pairs split 52–56% food_cuisine context (expected), but the Ukrainian forms appear MORE in food contexts (+12.7pp for Borshch, +13.5pp for Borsch). This is counterintuitive—one might expect the Russian "Borscht" to dominate recipes. Instead, the Ukrainian form is used by writers specifically engaging with Ukrainian food identity, while the Russian form appears in generic international recipe contexts. UNESCO's 2022 inscription of Ukrainian borscht accelerated this distinction.</w:t>
+      </w:r>
+    </w:p>
+    <w:p>
+      <w:pPr>
+        <w:pStyle w:val="Heading2"/>
+      </w:pPr>
+      <w:r>
+        <w:t>7.2 Food as Cultural Battleground</w:t>
+      </w:r>
+    </w:p>
+    <w:p>
+      <w:r>
+        <w:rPr>
+          <w:rFonts w:ascii="Cambria" w:hAnsi="Cambria"/>
+          <w:b w:val="0"/>
+          <w:sz w:val="22"/>
+        </w:rPr>
+        <w:t>Landmark pairs show a striking pattern: travel/tourism context massively favors Russian forms. Kiev Pechersk Lavra (travel: −36.4pp), Motherland Monument (−40.3pp), Saint Sophia Cathedral (−19.1pp), Potemkin Stairs (−12.5pp). Travel guides, review sites, and tourism marketing preserve Russian spellings because that is how the landmarks were internationally marketed for decades. This constitutes a seventh mechanism: tourism lock-in.</w:t>
+      </w:r>
+    </w:p>
+    <w:p>
+      <w:pPr>
+        <w:pStyle w:val="Heading2"/>
+      </w:pPr>
+      <w:r>
+        <w:t>7.1 Tourism Lock-In (Landmarks)</w:t>
+      </w:r>
+    </w:p>
+    <w:p>
+      <w:r>
+        <w:rPr>
+          <w:rFonts w:ascii="Cambria" w:hAnsi="Cambria"/>
+          <w:b w:val="0"/>
+          <w:sz w:val="22"/>
+        </w:rPr>
+        <w:t>While the six key pairs reveal distinct mechanisms, the remaining 49 pairs confirm these patterns at scale and reveal two additional mechanisms.</w:t>
+      </w:r>
+    </w:p>
+    <w:p>
+      <w:pPr>
+        <w:pStyle w:val="Heading1"/>
+      </w:pPr>
+      <w:r>
+        <w:t>7. Broader Patterns Across 55 Pairs</w:t>
       </w:r>
     </w:p>
     <w:p>

</xml_diff>

<commit_message>
Paper: add full pipeline architecture, 55-pair table with both adoption windows
- Fig 16: complete data flow from 7 sources → BigQuery → 3 analysis layers → 4 outputs
- Appendix I: all 55 pairs with Last 12m AND Since 2018 adoption rates
- Remove Spark/Dataproc from README (we use BigQuery directly)
- Architecture honestly shows BigQuery + Python + vast.ai GPU
</commit_message>
<xml_diff>
--- a/paper/kyivnotkiev_cl_paper.docx
+++ b/paper/kyivnotkiev_cl_paper.docx
@@ -19200,6 +19200,4553 @@
       </w:tr>
     </w:tbl>
     <w:p/>
+    <w:p>
+      <w:r>
+        <w:br w:type="page"/>
+      </w:r>
+    </w:p>
+    <w:p>
+      <w:pPr>
+        <w:pStyle w:val="Heading1"/>
+      </w:pPr>
+      <w:r>
+        <w:t>Appendix H: Full Pipeline Architecture</w:t>
+      </w:r>
+    </w:p>
+    <w:p>
+      <w:pPr>
+        <w:jc w:val="center"/>
+      </w:pPr>
+      <w:r>
+        <w:drawing>
+          <wp:inline xmlns:a="http://schemas.openxmlformats.org/drawingml/2006/main" xmlns:pic="http://schemas.openxmlformats.org/drawingml/2006/picture">
+            <wp:extent cx="5943600" cy="4233212"/>
+            <wp:docPr id="16" name="Picture 16"/>
+            <wp:cNvGraphicFramePr>
+              <a:graphicFrameLocks noChangeAspect="1"/>
+            </wp:cNvGraphicFramePr>
+            <a:graphic>
+              <a:graphicData uri="http://schemas.openxmlformats.org/drawingml/2006/picture">
+                <pic:pic>
+                  <pic:nvPicPr>
+                    <pic:cNvPr id="0" name="fig16_full_architecture.png"/>
+                    <pic:cNvPicPr/>
+                  </pic:nvPicPr>
+                  <pic:blipFill>
+                    <a:blip r:embed="rId24"/>
+                    <a:stretch>
+                      <a:fillRect/>
+                    </a:stretch>
+                  </pic:blipFill>
+                  <pic:spPr>
+                    <a:xfrm>
+                      <a:off x="0" y="0"/>
+                      <a:ext cx="5943600" cy="4233212"/>
+                    </a:xfrm>
+                    <a:prstGeom prst="rect"/>
+                  </pic:spPr>
+                </pic:pic>
+              </a:graphicData>
+            </a:graphic>
+          </wp:inline>
+        </w:drawing>
+      </w:r>
+    </w:p>
+    <w:p>
+      <w:pPr>
+        <w:jc w:val="center"/>
+      </w:pPr>
+      <w:r>
+        <w:rPr>
+          <w:i/>
+          <w:sz w:val="18"/>
+        </w:rPr>
+        <w:t>Figure 16: Complete data pipeline from 7 sources through three analysis layers to four outputs.</w:t>
+      </w:r>
+    </w:p>
+    <w:p>
+      <w:r>
+        <w:br w:type="page"/>
+      </w:r>
+    </w:p>
+    <w:p>
+      <w:pPr>
+        <w:pStyle w:val="Heading1"/>
+      </w:pPr>
+      <w:r>
+        <w:t>Appendix I: Complete Pair Adoption Table</w:t>
+      </w:r>
+    </w:p>
+    <w:p>
+      <w:r>
+        <w:rPr>
+          <w:sz w:val="20"/>
+        </w:rPr>
+        <w:t>All 55 enabled toponym pairs with adoption rates computed over two windows: last 12 months (current state) and since October 2018 (campaign lifetime). Starred pairs (★) are selected for deep computational linguistic analysis.</w:t>
+      </w:r>
+    </w:p>
+    <w:tbl>
+      <w:tblPr>
+        <w:tblStyle w:val="LightGrid-Accent1"/>
+        <w:tblW w:type="auto" w:w="0"/>
+        <w:tblLook w:firstColumn="1" w:firstRow="1" w:lastColumn="0" w:lastRow="0" w:noHBand="0" w:noVBand="1" w:val="04A0"/>
+      </w:tblPr>
+      <w:tblGrid>
+        <w:gridCol w:w="1560"/>
+        <w:gridCol w:w="1560"/>
+        <w:gridCol w:w="1560"/>
+        <w:gridCol w:w="1560"/>
+        <w:gridCol w:w="1560"/>
+        <w:gridCol w:w="1560"/>
+      </w:tblGrid>
+      <w:tr>
+        <w:tc>
+          <w:tcPr>
+            <w:tcW w:type="dxa" w:w="1560"/>
+          </w:tcPr>
+          <w:p>
+            <w:r>
+              <w:rPr>
+                <w:b/>
+                <w:sz w:val="16"/>
+              </w:rPr>
+              <w:t>Russian Form</w:t>
+            </w:r>
+          </w:p>
+        </w:tc>
+        <w:tc>
+          <w:tcPr>
+            <w:tcW w:type="dxa" w:w="1560"/>
+          </w:tcPr>
+          <w:p>
+            <w:r>
+              <w:rPr>
+                <w:b/>
+                <w:sz w:val="16"/>
+              </w:rPr>
+              <w:t>Ukrainian Form</w:t>
+            </w:r>
+          </w:p>
+        </w:tc>
+        <w:tc>
+          <w:tcPr>
+            <w:tcW w:type="dxa" w:w="1560"/>
+          </w:tcPr>
+          <w:p>
+            <w:r>
+              <w:rPr>
+                <w:b/>
+                <w:sz w:val="16"/>
+              </w:rPr>
+              <w:t>Category</w:t>
+            </w:r>
+          </w:p>
+        </w:tc>
+        <w:tc>
+          <w:tcPr>
+            <w:tcW w:type="dxa" w:w="1560"/>
+          </w:tcPr>
+          <w:p>
+            <w:r>
+              <w:rPr>
+                <w:b/>
+                <w:sz w:val="16"/>
+              </w:rPr>
+              <w:t>Last 12m</w:t>
+            </w:r>
+          </w:p>
+        </w:tc>
+        <w:tc>
+          <w:tcPr>
+            <w:tcW w:type="dxa" w:w="1560"/>
+          </w:tcPr>
+          <w:p>
+            <w:r>
+              <w:rPr>
+                <w:b/>
+                <w:sz w:val="16"/>
+              </w:rPr>
+              <w:t>Since 2018</w:t>
+            </w:r>
+          </w:p>
+        </w:tc>
+        <w:tc>
+          <w:tcPr>
+            <w:tcW w:type="dxa" w:w="1560"/>
+          </w:tcPr>
+          <w:p>
+            <w:r>
+              <w:rPr>
+                <w:b/>
+                <w:sz w:val="16"/>
+              </w:rPr>
+              <w:t>★</w:t>
+            </w:r>
+          </w:p>
+        </w:tc>
+      </w:tr>
+      <w:tr>
+        <w:tc>
+          <w:tcPr>
+            <w:tcW w:type="dxa" w:w="1560"/>
+          </w:tcPr>
+          <w:p>
+            <w:r>
+              <w:rPr>
+                <w:sz w:val="16"/>
+              </w:rPr>
+              <w:t>the Ukraine</w:t>
+            </w:r>
+          </w:p>
+        </w:tc>
+        <w:tc>
+          <w:tcPr>
+            <w:tcW w:type="dxa" w:w="1560"/>
+          </w:tcPr>
+          <w:p>
+            <w:r>
+              <w:rPr>
+                <w:sz w:val="16"/>
+              </w:rPr>
+              <w:t>Ukraine</w:t>
+            </w:r>
+          </w:p>
+        </w:tc>
+        <w:tc>
+          <w:tcPr>
+            <w:tcW w:type="dxa" w:w="1560"/>
+          </w:tcPr>
+          <w:p>
+            <w:r>
+              <w:rPr>
+                <w:sz w:val="16"/>
+              </w:rPr>
+              <w:t>country</w:t>
+            </w:r>
+          </w:p>
+        </w:tc>
+        <w:tc>
+          <w:tcPr>
+            <w:tcW w:type="dxa" w:w="1560"/>
+          </w:tcPr>
+          <w:p>
+            <w:r>
+              <w:rPr>
+                <w:sz w:val="16"/>
+              </w:rPr>
+              <w:t>63.9%</w:t>
+            </w:r>
+          </w:p>
+        </w:tc>
+        <w:tc>
+          <w:tcPr>
+            <w:tcW w:type="dxa" w:w="1560"/>
+          </w:tcPr>
+          <w:p>
+            <w:r>
+              <w:rPr>
+                <w:sz w:val="16"/>
+              </w:rPr>
+              <w:t>64.2%</w:t>
+            </w:r>
+          </w:p>
+        </w:tc>
+        <w:tc>
+          <w:tcPr>
+            <w:tcW w:type="dxa" w:w="1560"/>
+          </w:tcPr>
+          <w:p>
+            <w:r>
+              <w:rPr>
+                <w:sz w:val="16"/>
+              </w:rPr>
+            </w:r>
+          </w:p>
+        </w:tc>
+      </w:tr>
+      <w:tr>
+        <w:tc>
+          <w:tcPr>
+            <w:tcW w:type="dxa" w:w="1560"/>
+          </w:tcPr>
+          <w:p>
+            <w:r>
+              <w:rPr>
+                <w:sz w:val="16"/>
+              </w:rPr>
+              <w:t>Kiev cake</w:t>
+            </w:r>
+          </w:p>
+        </w:tc>
+        <w:tc>
+          <w:tcPr>
+            <w:tcW w:type="dxa" w:w="1560"/>
+          </w:tcPr>
+          <w:p>
+            <w:r>
+              <w:rPr>
+                <w:sz w:val="16"/>
+              </w:rPr>
+              <w:t>Kyiv cake</w:t>
+            </w:r>
+          </w:p>
+        </w:tc>
+        <w:tc>
+          <w:tcPr>
+            <w:tcW w:type="dxa" w:w="1560"/>
+          </w:tcPr>
+          <w:p>
+            <w:r>
+              <w:rPr>
+                <w:sz w:val="16"/>
+              </w:rPr>
+              <w:t>food</w:t>
+            </w:r>
+          </w:p>
+        </w:tc>
+        <w:tc>
+          <w:tcPr>
+            <w:tcW w:type="dxa" w:w="1560"/>
+          </w:tcPr>
+          <w:p>
+            <w:r>
+              <w:rPr>
+                <w:sz w:val="16"/>
+              </w:rPr>
+              <w:t>68.1%</w:t>
+            </w:r>
+          </w:p>
+        </w:tc>
+        <w:tc>
+          <w:tcPr>
+            <w:tcW w:type="dxa" w:w="1560"/>
+          </w:tcPr>
+          <w:p>
+            <w:r>
+              <w:rPr>
+                <w:sz w:val="16"/>
+              </w:rPr>
+              <w:t>48.0%</w:t>
+            </w:r>
+          </w:p>
+        </w:tc>
+        <w:tc>
+          <w:tcPr>
+            <w:tcW w:type="dxa" w:w="1560"/>
+          </w:tcPr>
+          <w:p>
+            <w:r>
+              <w:rPr>
+                <w:sz w:val="16"/>
+              </w:rPr>
+            </w:r>
+          </w:p>
+        </w:tc>
+      </w:tr>
+      <w:tr>
+        <w:tc>
+          <w:tcPr>
+            <w:tcW w:type="dxa" w:w="1560"/>
+          </w:tcPr>
+          <w:p>
+            <w:r>
+              <w:rPr>
+                <w:sz w:val="16"/>
+              </w:rPr>
+              <w:t>Vareniki</w:t>
+            </w:r>
+          </w:p>
+        </w:tc>
+        <w:tc>
+          <w:tcPr>
+            <w:tcW w:type="dxa" w:w="1560"/>
+          </w:tcPr>
+          <w:p>
+            <w:r>
+              <w:rPr>
+                <w:sz w:val="16"/>
+              </w:rPr>
+              <w:t>Varenyky</w:t>
+            </w:r>
+          </w:p>
+        </w:tc>
+        <w:tc>
+          <w:tcPr>
+            <w:tcW w:type="dxa" w:w="1560"/>
+          </w:tcPr>
+          <w:p>
+            <w:r>
+              <w:rPr>
+                <w:sz w:val="16"/>
+              </w:rPr>
+              <w:t>food</w:t>
+            </w:r>
+          </w:p>
+        </w:tc>
+        <w:tc>
+          <w:tcPr>
+            <w:tcW w:type="dxa" w:w="1560"/>
+          </w:tcPr>
+          <w:p>
+            <w:r>
+              <w:rPr>
+                <w:sz w:val="16"/>
+              </w:rPr>
+              <w:t>50.7%</w:t>
+            </w:r>
+          </w:p>
+        </w:tc>
+        <w:tc>
+          <w:tcPr>
+            <w:tcW w:type="dxa" w:w="1560"/>
+          </w:tcPr>
+          <w:p>
+            <w:r>
+              <w:rPr>
+                <w:sz w:val="16"/>
+              </w:rPr>
+              <w:t>43.3%</w:t>
+            </w:r>
+          </w:p>
+        </w:tc>
+        <w:tc>
+          <w:tcPr>
+            <w:tcW w:type="dxa" w:w="1560"/>
+          </w:tcPr>
+          <w:p>
+            <w:r>
+              <w:rPr>
+                <w:sz w:val="16"/>
+              </w:rPr>
+            </w:r>
+          </w:p>
+        </w:tc>
+      </w:tr>
+      <w:tr>
+        <w:tc>
+          <w:tcPr>
+            <w:tcW w:type="dxa" w:w="1560"/>
+          </w:tcPr>
+          <w:p>
+            <w:r>
+              <w:rPr>
+                <w:sz w:val="16"/>
+              </w:rPr>
+              <w:t>Borscht</w:t>
+            </w:r>
+          </w:p>
+        </w:tc>
+        <w:tc>
+          <w:tcPr>
+            <w:tcW w:type="dxa" w:w="1560"/>
+          </w:tcPr>
+          <w:p>
+            <w:r>
+              <w:rPr>
+                <w:sz w:val="16"/>
+              </w:rPr>
+              <w:t>Borshch</w:t>
+            </w:r>
+          </w:p>
+        </w:tc>
+        <w:tc>
+          <w:tcPr>
+            <w:tcW w:type="dxa" w:w="1560"/>
+          </w:tcPr>
+          <w:p>
+            <w:r>
+              <w:rPr>
+                <w:sz w:val="16"/>
+              </w:rPr>
+              <w:t>food</w:t>
+            </w:r>
+          </w:p>
+        </w:tc>
+        <w:tc>
+          <w:tcPr>
+            <w:tcW w:type="dxa" w:w="1560"/>
+          </w:tcPr>
+          <w:p>
+            <w:r>
+              <w:rPr>
+                <w:sz w:val="16"/>
+              </w:rPr>
+              <w:t>39.2%</w:t>
+            </w:r>
+          </w:p>
+        </w:tc>
+        <w:tc>
+          <w:tcPr>
+            <w:tcW w:type="dxa" w:w="1560"/>
+          </w:tcPr>
+          <w:p>
+            <w:r>
+              <w:rPr>
+                <w:sz w:val="16"/>
+              </w:rPr>
+              <w:t>34.0%</w:t>
+            </w:r>
+          </w:p>
+        </w:tc>
+        <w:tc>
+          <w:tcPr>
+            <w:tcW w:type="dxa" w:w="1560"/>
+          </w:tcPr>
+          <w:p>
+            <w:r>
+              <w:rPr>
+                <w:sz w:val="16"/>
+              </w:rPr>
+            </w:r>
+          </w:p>
+        </w:tc>
+      </w:tr>
+      <w:tr>
+        <w:tc>
+          <w:tcPr>
+            <w:tcW w:type="dxa" w:w="1560"/>
+          </w:tcPr>
+          <w:p>
+            <w:r>
+              <w:rPr>
+                <w:sz w:val="16"/>
+              </w:rPr>
+              <w:t>Chicken Kiev</w:t>
+            </w:r>
+          </w:p>
+        </w:tc>
+        <w:tc>
+          <w:tcPr>
+            <w:tcW w:type="dxa" w:w="1560"/>
+          </w:tcPr>
+          <w:p>
+            <w:r>
+              <w:rPr>
+                <w:sz w:val="16"/>
+              </w:rPr>
+              <w:t>Chicken Kyiv</w:t>
+            </w:r>
+          </w:p>
+        </w:tc>
+        <w:tc>
+          <w:tcPr>
+            <w:tcW w:type="dxa" w:w="1560"/>
+          </w:tcPr>
+          <w:p>
+            <w:r>
+              <w:rPr>
+                <w:sz w:val="16"/>
+              </w:rPr>
+              <w:t>food</w:t>
+            </w:r>
+          </w:p>
+        </w:tc>
+        <w:tc>
+          <w:tcPr>
+            <w:tcW w:type="dxa" w:w="1560"/>
+          </w:tcPr>
+          <w:p>
+            <w:r>
+              <w:rPr>
+                <w:sz w:val="16"/>
+              </w:rPr>
+              <w:t>36.4%</w:t>
+            </w:r>
+          </w:p>
+        </w:tc>
+        <w:tc>
+          <w:tcPr>
+            <w:tcW w:type="dxa" w:w="1560"/>
+          </w:tcPr>
+          <w:p>
+            <w:r>
+              <w:rPr>
+                <w:sz w:val="16"/>
+              </w:rPr>
+              <w:t>29.3%</w:t>
+            </w:r>
+          </w:p>
+        </w:tc>
+        <w:tc>
+          <w:tcPr>
+            <w:tcW w:type="dxa" w:w="1560"/>
+          </w:tcPr>
+          <w:p>
+            <w:r>
+              <w:rPr>
+                <w:sz w:val="16"/>
+              </w:rPr>
+            </w:r>
+          </w:p>
+        </w:tc>
+      </w:tr>
+      <w:tr>
+        <w:tc>
+          <w:tcPr>
+            <w:tcW w:type="dxa" w:w="1560"/>
+          </w:tcPr>
+          <w:p>
+            <w:r>
+              <w:rPr>
+                <w:sz w:val="16"/>
+              </w:rPr>
+              <w:t>Borsch</w:t>
+            </w:r>
+          </w:p>
+        </w:tc>
+        <w:tc>
+          <w:tcPr>
+            <w:tcW w:type="dxa" w:w="1560"/>
+          </w:tcPr>
+          <w:p>
+            <w:r>
+              <w:rPr>
+                <w:sz w:val="16"/>
+              </w:rPr>
+              <w:t>Borshch</w:t>
+            </w:r>
+          </w:p>
+        </w:tc>
+        <w:tc>
+          <w:tcPr>
+            <w:tcW w:type="dxa" w:w="1560"/>
+          </w:tcPr>
+          <w:p>
+            <w:r>
+              <w:rPr>
+                <w:sz w:val="16"/>
+              </w:rPr>
+              <w:t>food</w:t>
+            </w:r>
+          </w:p>
+        </w:tc>
+        <w:tc>
+          <w:tcPr>
+            <w:tcW w:type="dxa" w:w="1560"/>
+          </w:tcPr>
+          <w:p>
+            <w:r>
+              <w:rPr>
+                <w:sz w:val="16"/>
+              </w:rPr>
+              <w:t>30.0%</w:t>
+            </w:r>
+          </w:p>
+        </w:tc>
+        <w:tc>
+          <w:tcPr>
+            <w:tcW w:type="dxa" w:w="1560"/>
+          </w:tcPr>
+          <w:p>
+            <w:r>
+              <w:rPr>
+                <w:sz w:val="16"/>
+              </w:rPr>
+              <w:t>26.8%</w:t>
+            </w:r>
+          </w:p>
+        </w:tc>
+        <w:tc>
+          <w:tcPr>
+            <w:tcW w:type="dxa" w:w="1560"/>
+          </w:tcPr>
+          <w:p>
+            <w:r>
+              <w:rPr>
+                <w:sz w:val="16"/>
+              </w:rPr>
+            </w:r>
+          </w:p>
+        </w:tc>
+      </w:tr>
+      <w:tr>
+        <w:tc>
+          <w:tcPr>
+            <w:tcW w:type="dxa" w:w="1560"/>
+          </w:tcPr>
+          <w:p>
+            <w:r>
+              <w:rPr>
+                <w:sz w:val="16"/>
+              </w:rPr>
+              <w:t>Zakarpatye</w:t>
+            </w:r>
+          </w:p>
+        </w:tc>
+        <w:tc>
+          <w:tcPr>
+            <w:tcW w:type="dxa" w:w="1560"/>
+          </w:tcPr>
+          <w:p>
+            <w:r>
+              <w:rPr>
+                <w:sz w:val="16"/>
+              </w:rPr>
+              <w:t>Zakarpattia</w:t>
+            </w:r>
+          </w:p>
+        </w:tc>
+        <w:tc>
+          <w:tcPr>
+            <w:tcW w:type="dxa" w:w="1560"/>
+          </w:tcPr>
+          <w:p>
+            <w:r>
+              <w:rPr>
+                <w:sz w:val="16"/>
+              </w:rPr>
+              <w:t>geographical</w:t>
+            </w:r>
+          </w:p>
+        </w:tc>
+        <w:tc>
+          <w:tcPr>
+            <w:tcW w:type="dxa" w:w="1560"/>
+          </w:tcPr>
+          <w:p>
+            <w:r>
+              <w:rPr>
+                <w:sz w:val="16"/>
+              </w:rPr>
+              <w:t>94.2%</w:t>
+            </w:r>
+          </w:p>
+        </w:tc>
+        <w:tc>
+          <w:tcPr>
+            <w:tcW w:type="dxa" w:w="1560"/>
+          </w:tcPr>
+          <w:p>
+            <w:r>
+              <w:rPr>
+                <w:sz w:val="16"/>
+              </w:rPr>
+              <w:t>85.7%</w:t>
+            </w:r>
+          </w:p>
+        </w:tc>
+        <w:tc>
+          <w:tcPr>
+            <w:tcW w:type="dxa" w:w="1560"/>
+          </w:tcPr>
+          <w:p>
+            <w:r>
+              <w:rPr>
+                <w:sz w:val="16"/>
+              </w:rPr>
+            </w:r>
+          </w:p>
+        </w:tc>
+      </w:tr>
+      <w:tr>
+        <w:tc>
+          <w:tcPr>
+            <w:tcW w:type="dxa" w:w="1560"/>
+          </w:tcPr>
+          <w:p>
+            <w:r>
+              <w:rPr>
+                <w:sz w:val="16"/>
+              </w:rPr>
+              <w:t>Chernovtsy</w:t>
+            </w:r>
+          </w:p>
+        </w:tc>
+        <w:tc>
+          <w:tcPr>
+            <w:tcW w:type="dxa" w:w="1560"/>
+          </w:tcPr>
+          <w:p>
+            <w:r>
+              <w:rPr>
+                <w:sz w:val="16"/>
+              </w:rPr>
+              <w:t>Chernivtsi</w:t>
+            </w:r>
+          </w:p>
+        </w:tc>
+        <w:tc>
+          <w:tcPr>
+            <w:tcW w:type="dxa" w:w="1560"/>
+          </w:tcPr>
+          <w:p>
+            <w:r>
+              <w:rPr>
+                <w:sz w:val="16"/>
+              </w:rPr>
+              <w:t>geographical</w:t>
+            </w:r>
+          </w:p>
+        </w:tc>
+        <w:tc>
+          <w:tcPr>
+            <w:tcW w:type="dxa" w:w="1560"/>
+          </w:tcPr>
+          <w:p>
+            <w:r>
+              <w:rPr>
+                <w:sz w:val="16"/>
+              </w:rPr>
+              <w:t>91.2%</w:t>
+            </w:r>
+          </w:p>
+        </w:tc>
+        <w:tc>
+          <w:tcPr>
+            <w:tcW w:type="dxa" w:w="1560"/>
+          </w:tcPr>
+          <w:p>
+            <w:r>
+              <w:rPr>
+                <w:sz w:val="16"/>
+              </w:rPr>
+              <w:t>93.8%</w:t>
+            </w:r>
+          </w:p>
+        </w:tc>
+        <w:tc>
+          <w:tcPr>
+            <w:tcW w:type="dxa" w:w="1560"/>
+          </w:tcPr>
+          <w:p>
+            <w:r>
+              <w:rPr>
+                <w:sz w:val="16"/>
+              </w:rPr>
+            </w:r>
+          </w:p>
+        </w:tc>
+      </w:tr>
+      <w:tr>
+        <w:tc>
+          <w:tcPr>
+            <w:tcW w:type="dxa" w:w="1560"/>
+          </w:tcPr>
+          <w:p>
+            <w:r>
+              <w:rPr>
+                <w:sz w:val="16"/>
+              </w:rPr>
+              <w:t>Artemovsk</w:t>
+            </w:r>
+          </w:p>
+        </w:tc>
+        <w:tc>
+          <w:tcPr>
+            <w:tcW w:type="dxa" w:w="1560"/>
+          </w:tcPr>
+          <w:p>
+            <w:r>
+              <w:rPr>
+                <w:sz w:val="16"/>
+              </w:rPr>
+              <w:t>Bakhmut</w:t>
+            </w:r>
+          </w:p>
+        </w:tc>
+        <w:tc>
+          <w:tcPr>
+            <w:tcW w:type="dxa" w:w="1560"/>
+          </w:tcPr>
+          <w:p>
+            <w:r>
+              <w:rPr>
+                <w:sz w:val="16"/>
+              </w:rPr>
+              <w:t>geographical</w:t>
+            </w:r>
+          </w:p>
+        </w:tc>
+        <w:tc>
+          <w:tcPr>
+            <w:tcW w:type="dxa" w:w="1560"/>
+          </w:tcPr>
+          <w:p>
+            <w:r>
+              <w:rPr>
+                <w:sz w:val="16"/>
+              </w:rPr>
+              <w:t>89.6%</w:t>
+            </w:r>
+          </w:p>
+        </w:tc>
+        <w:tc>
+          <w:tcPr>
+            <w:tcW w:type="dxa" w:w="1560"/>
+          </w:tcPr>
+          <w:p>
+            <w:r>
+              <w:rPr>
+                <w:sz w:val="16"/>
+              </w:rPr>
+              <w:t>88.4%</w:t>
+            </w:r>
+          </w:p>
+        </w:tc>
+        <w:tc>
+          <w:tcPr>
+            <w:tcW w:type="dxa" w:w="1560"/>
+          </w:tcPr>
+          <w:p>
+            <w:r>
+              <w:rPr>
+                <w:sz w:val="16"/>
+              </w:rPr>
+              <w:t>★</w:t>
+            </w:r>
+          </w:p>
+        </w:tc>
+      </w:tr>
+      <w:tr>
+        <w:tc>
+          <w:tcPr>
+            <w:tcW w:type="dxa" w:w="1560"/>
+          </w:tcPr>
+          <w:p>
+            <w:r>
+              <w:rPr>
+                <w:sz w:val="16"/>
+              </w:rPr>
+              <w:t>Ternopol</w:t>
+            </w:r>
+          </w:p>
+        </w:tc>
+        <w:tc>
+          <w:tcPr>
+            <w:tcW w:type="dxa" w:w="1560"/>
+          </w:tcPr>
+          <w:p>
+            <w:r>
+              <w:rPr>
+                <w:sz w:val="16"/>
+              </w:rPr>
+              <w:t>Ternopil</w:t>
+            </w:r>
+          </w:p>
+        </w:tc>
+        <w:tc>
+          <w:tcPr>
+            <w:tcW w:type="dxa" w:w="1560"/>
+          </w:tcPr>
+          <w:p>
+            <w:r>
+              <w:rPr>
+                <w:sz w:val="16"/>
+              </w:rPr>
+              <w:t>geographical</w:t>
+            </w:r>
+          </w:p>
+        </w:tc>
+        <w:tc>
+          <w:tcPr>
+            <w:tcW w:type="dxa" w:w="1560"/>
+          </w:tcPr>
+          <w:p>
+            <w:r>
+              <w:rPr>
+                <w:sz w:val="16"/>
+              </w:rPr>
+              <w:t>88.0%</w:t>
+            </w:r>
+          </w:p>
+        </w:tc>
+        <w:tc>
+          <w:tcPr>
+            <w:tcW w:type="dxa" w:w="1560"/>
+          </w:tcPr>
+          <w:p>
+            <w:r>
+              <w:rPr>
+                <w:sz w:val="16"/>
+              </w:rPr>
+              <w:t>95.9%</w:t>
+            </w:r>
+          </w:p>
+        </w:tc>
+        <w:tc>
+          <w:tcPr>
+            <w:tcW w:type="dxa" w:w="1560"/>
+          </w:tcPr>
+          <w:p>
+            <w:r>
+              <w:rPr>
+                <w:sz w:val="16"/>
+              </w:rPr>
+            </w:r>
+          </w:p>
+        </w:tc>
+      </w:tr>
+      <w:tr>
+        <w:tc>
+          <w:tcPr>
+            <w:tcW w:type="dxa" w:w="1560"/>
+          </w:tcPr>
+          <w:p>
+            <w:r>
+              <w:rPr>
+                <w:sz w:val="16"/>
+              </w:rPr>
+              <w:t>Kharkov</w:t>
+            </w:r>
+          </w:p>
+        </w:tc>
+        <w:tc>
+          <w:tcPr>
+            <w:tcW w:type="dxa" w:w="1560"/>
+          </w:tcPr>
+          <w:p>
+            <w:r>
+              <w:rPr>
+                <w:sz w:val="16"/>
+              </w:rPr>
+              <w:t>Kharkiv</w:t>
+            </w:r>
+          </w:p>
+        </w:tc>
+        <w:tc>
+          <w:tcPr>
+            <w:tcW w:type="dxa" w:w="1560"/>
+          </w:tcPr>
+          <w:p>
+            <w:r>
+              <w:rPr>
+                <w:sz w:val="16"/>
+              </w:rPr>
+              <w:t>geographical</w:t>
+            </w:r>
+          </w:p>
+        </w:tc>
+        <w:tc>
+          <w:tcPr>
+            <w:tcW w:type="dxa" w:w="1560"/>
+          </w:tcPr>
+          <w:p>
+            <w:r>
+              <w:rPr>
+                <w:sz w:val="16"/>
+              </w:rPr>
+              <w:t>82.9%</w:t>
+            </w:r>
+          </w:p>
+        </w:tc>
+        <w:tc>
+          <w:tcPr>
+            <w:tcW w:type="dxa" w:w="1560"/>
+          </w:tcPr>
+          <w:p>
+            <w:r>
+              <w:rPr>
+                <w:sz w:val="16"/>
+              </w:rPr>
+              <w:t>78.6%</w:t>
+            </w:r>
+          </w:p>
+        </w:tc>
+        <w:tc>
+          <w:tcPr>
+            <w:tcW w:type="dxa" w:w="1560"/>
+          </w:tcPr>
+          <w:p>
+            <w:r>
+              <w:rPr>
+                <w:sz w:val="16"/>
+              </w:rPr>
+            </w:r>
+          </w:p>
+        </w:tc>
+      </w:tr>
+      <w:tr>
+        <w:tc>
+          <w:tcPr>
+            <w:tcW w:type="dxa" w:w="1560"/>
+          </w:tcPr>
+          <w:p>
+            <w:r>
+              <w:rPr>
+                <w:sz w:val="16"/>
+              </w:rPr>
+              <w:t>Lvov</w:t>
+            </w:r>
+          </w:p>
+        </w:tc>
+        <w:tc>
+          <w:tcPr>
+            <w:tcW w:type="dxa" w:w="1560"/>
+          </w:tcPr>
+          <w:p>
+            <w:r>
+              <w:rPr>
+                <w:sz w:val="16"/>
+              </w:rPr>
+              <w:t>Lviv</w:t>
+            </w:r>
+          </w:p>
+        </w:tc>
+        <w:tc>
+          <w:tcPr>
+            <w:tcW w:type="dxa" w:w="1560"/>
+          </w:tcPr>
+          <w:p>
+            <w:r>
+              <w:rPr>
+                <w:sz w:val="16"/>
+              </w:rPr>
+              <w:t>geographical</w:t>
+            </w:r>
+          </w:p>
+        </w:tc>
+        <w:tc>
+          <w:tcPr>
+            <w:tcW w:type="dxa" w:w="1560"/>
+          </w:tcPr>
+          <w:p>
+            <w:r>
+              <w:rPr>
+                <w:sz w:val="16"/>
+              </w:rPr>
+              <w:t>81.8%</w:t>
+            </w:r>
+          </w:p>
+        </w:tc>
+        <w:tc>
+          <w:tcPr>
+            <w:tcW w:type="dxa" w:w="1560"/>
+          </w:tcPr>
+          <w:p>
+            <w:r>
+              <w:rPr>
+                <w:sz w:val="16"/>
+              </w:rPr>
+              <w:t>88.3%</w:t>
+            </w:r>
+          </w:p>
+        </w:tc>
+        <w:tc>
+          <w:tcPr>
+            <w:tcW w:type="dxa" w:w="1560"/>
+          </w:tcPr>
+          <w:p>
+            <w:r>
+              <w:rPr>
+                <w:sz w:val="16"/>
+              </w:rPr>
+            </w:r>
+          </w:p>
+        </w:tc>
+      </w:tr>
+      <w:tr>
+        <w:tc>
+          <w:tcPr>
+            <w:tcW w:type="dxa" w:w="1560"/>
+          </w:tcPr>
+          <w:p>
+            <w:r>
+              <w:rPr>
+                <w:sz w:val="16"/>
+              </w:rPr>
+              <w:t>Cherkassy</w:t>
+            </w:r>
+          </w:p>
+        </w:tc>
+        <w:tc>
+          <w:tcPr>
+            <w:tcW w:type="dxa" w:w="1560"/>
+          </w:tcPr>
+          <w:p>
+            <w:r>
+              <w:rPr>
+                <w:sz w:val="16"/>
+              </w:rPr>
+              <w:t>Cherkasy</w:t>
+            </w:r>
+          </w:p>
+        </w:tc>
+        <w:tc>
+          <w:tcPr>
+            <w:tcW w:type="dxa" w:w="1560"/>
+          </w:tcPr>
+          <w:p>
+            <w:r>
+              <w:rPr>
+                <w:sz w:val="16"/>
+              </w:rPr>
+              <w:t>geographical</w:t>
+            </w:r>
+          </w:p>
+        </w:tc>
+        <w:tc>
+          <w:tcPr>
+            <w:tcW w:type="dxa" w:w="1560"/>
+          </w:tcPr>
+          <w:p>
+            <w:r>
+              <w:rPr>
+                <w:sz w:val="16"/>
+              </w:rPr>
+              <w:t>81.7%</w:t>
+            </w:r>
+          </w:p>
+        </w:tc>
+        <w:tc>
+          <w:tcPr>
+            <w:tcW w:type="dxa" w:w="1560"/>
+          </w:tcPr>
+          <w:p>
+            <w:r>
+              <w:rPr>
+                <w:sz w:val="16"/>
+              </w:rPr>
+              <w:t>77.8%</w:t>
+            </w:r>
+          </w:p>
+        </w:tc>
+        <w:tc>
+          <w:tcPr>
+            <w:tcW w:type="dxa" w:w="1560"/>
+          </w:tcPr>
+          <w:p>
+            <w:r>
+              <w:rPr>
+                <w:sz w:val="16"/>
+              </w:rPr>
+            </w:r>
+          </w:p>
+        </w:tc>
+      </w:tr>
+      <w:tr>
+        <w:tc>
+          <w:tcPr>
+            <w:tcW w:type="dxa" w:w="1560"/>
+          </w:tcPr>
+          <w:p>
+            <w:r>
+              <w:rPr>
+                <w:sz w:val="16"/>
+              </w:rPr>
+              <w:t>Rovno</w:t>
+            </w:r>
+          </w:p>
+        </w:tc>
+        <w:tc>
+          <w:tcPr>
+            <w:tcW w:type="dxa" w:w="1560"/>
+          </w:tcPr>
+          <w:p>
+            <w:r>
+              <w:rPr>
+                <w:sz w:val="16"/>
+              </w:rPr>
+              <w:t>Rivne</w:t>
+            </w:r>
+          </w:p>
+        </w:tc>
+        <w:tc>
+          <w:tcPr>
+            <w:tcW w:type="dxa" w:w="1560"/>
+          </w:tcPr>
+          <w:p>
+            <w:r>
+              <w:rPr>
+                <w:sz w:val="16"/>
+              </w:rPr>
+              <w:t>geographical</w:t>
+            </w:r>
+          </w:p>
+        </w:tc>
+        <w:tc>
+          <w:tcPr>
+            <w:tcW w:type="dxa" w:w="1560"/>
+          </w:tcPr>
+          <w:p>
+            <w:r>
+              <w:rPr>
+                <w:sz w:val="16"/>
+              </w:rPr>
+              <w:t>76.6%</w:t>
+            </w:r>
+          </w:p>
+        </w:tc>
+        <w:tc>
+          <w:tcPr>
+            <w:tcW w:type="dxa" w:w="1560"/>
+          </w:tcPr>
+          <w:p>
+            <w:r>
+              <w:rPr>
+                <w:sz w:val="16"/>
+              </w:rPr>
+              <w:t>76.6%</w:t>
+            </w:r>
+          </w:p>
+        </w:tc>
+        <w:tc>
+          <w:tcPr>
+            <w:tcW w:type="dxa" w:w="1560"/>
+          </w:tcPr>
+          <w:p>
+            <w:r>
+              <w:rPr>
+                <w:sz w:val="16"/>
+              </w:rPr>
+            </w:r>
+          </w:p>
+        </w:tc>
+      </w:tr>
+      <w:tr>
+        <w:tc>
+          <w:tcPr>
+            <w:tcW w:type="dxa" w:w="1560"/>
+          </w:tcPr>
+          <w:p>
+            <w:r>
+              <w:rPr>
+                <w:sz w:val="16"/>
+              </w:rPr>
+              <w:t>Zhitomir</w:t>
+            </w:r>
+          </w:p>
+        </w:tc>
+        <w:tc>
+          <w:tcPr>
+            <w:tcW w:type="dxa" w:w="1560"/>
+          </w:tcPr>
+          <w:p>
+            <w:r>
+              <w:rPr>
+                <w:sz w:val="16"/>
+              </w:rPr>
+              <w:t>Zhytomyr</w:t>
+            </w:r>
+          </w:p>
+        </w:tc>
+        <w:tc>
+          <w:tcPr>
+            <w:tcW w:type="dxa" w:w="1560"/>
+          </w:tcPr>
+          <w:p>
+            <w:r>
+              <w:rPr>
+                <w:sz w:val="16"/>
+              </w:rPr>
+              <w:t>geographical</w:t>
+            </w:r>
+          </w:p>
+        </w:tc>
+        <w:tc>
+          <w:tcPr>
+            <w:tcW w:type="dxa" w:w="1560"/>
+          </w:tcPr>
+          <w:p>
+            <w:r>
+              <w:rPr>
+                <w:sz w:val="16"/>
+              </w:rPr>
+              <w:t>73.7%</w:t>
+            </w:r>
+          </w:p>
+        </w:tc>
+        <w:tc>
+          <w:tcPr>
+            <w:tcW w:type="dxa" w:w="1560"/>
+          </w:tcPr>
+          <w:p>
+            <w:r>
+              <w:rPr>
+                <w:sz w:val="16"/>
+              </w:rPr>
+              <w:t>76.8%</w:t>
+            </w:r>
+          </w:p>
+        </w:tc>
+        <w:tc>
+          <w:tcPr>
+            <w:tcW w:type="dxa" w:w="1560"/>
+          </w:tcPr>
+          <w:p>
+            <w:r>
+              <w:rPr>
+                <w:sz w:val="16"/>
+              </w:rPr>
+            </w:r>
+          </w:p>
+        </w:tc>
+      </w:tr>
+      <w:tr>
+        <w:tc>
+          <w:tcPr>
+            <w:tcW w:type="dxa" w:w="1560"/>
+          </w:tcPr>
+          <w:p>
+            <w:r>
+              <w:rPr>
+                <w:sz w:val="16"/>
+              </w:rPr>
+              <w:t>Dnepropetrovsk</w:t>
+            </w:r>
+          </w:p>
+        </w:tc>
+        <w:tc>
+          <w:tcPr>
+            <w:tcW w:type="dxa" w:w="1560"/>
+          </w:tcPr>
+          <w:p>
+            <w:r>
+              <w:rPr>
+                <w:sz w:val="16"/>
+              </w:rPr>
+              <w:t>Dnipro</w:t>
+            </w:r>
+          </w:p>
+        </w:tc>
+        <w:tc>
+          <w:tcPr>
+            <w:tcW w:type="dxa" w:w="1560"/>
+          </w:tcPr>
+          <w:p>
+            <w:r>
+              <w:rPr>
+                <w:sz w:val="16"/>
+              </w:rPr>
+              <w:t>geographical</w:t>
+            </w:r>
+          </w:p>
+        </w:tc>
+        <w:tc>
+          <w:tcPr>
+            <w:tcW w:type="dxa" w:w="1560"/>
+          </w:tcPr>
+          <w:p>
+            <w:r>
+              <w:rPr>
+                <w:sz w:val="16"/>
+              </w:rPr>
+              <w:t>72.2%</w:t>
+            </w:r>
+          </w:p>
+        </w:tc>
+        <w:tc>
+          <w:tcPr>
+            <w:tcW w:type="dxa" w:w="1560"/>
+          </w:tcPr>
+          <w:p>
+            <w:r>
+              <w:rPr>
+                <w:sz w:val="16"/>
+              </w:rPr>
+              <w:t>76.3%</w:t>
+            </w:r>
+          </w:p>
+        </w:tc>
+        <w:tc>
+          <w:tcPr>
+            <w:tcW w:type="dxa" w:w="1560"/>
+          </w:tcPr>
+          <w:p>
+            <w:r>
+              <w:rPr>
+                <w:sz w:val="16"/>
+              </w:rPr>
+            </w:r>
+          </w:p>
+        </w:tc>
+      </w:tr>
+      <w:tr>
+        <w:tc>
+          <w:tcPr>
+            <w:tcW w:type="dxa" w:w="1560"/>
+          </w:tcPr>
+          <w:p>
+            <w:r>
+              <w:rPr>
+                <w:sz w:val="16"/>
+              </w:rPr>
+              <w:t>Lugansk</w:t>
+            </w:r>
+          </w:p>
+        </w:tc>
+        <w:tc>
+          <w:tcPr>
+            <w:tcW w:type="dxa" w:w="1560"/>
+          </w:tcPr>
+          <w:p>
+            <w:r>
+              <w:rPr>
+                <w:sz w:val="16"/>
+              </w:rPr>
+              <w:t>Luhansk</w:t>
+            </w:r>
+          </w:p>
+        </w:tc>
+        <w:tc>
+          <w:tcPr>
+            <w:tcW w:type="dxa" w:w="1560"/>
+          </w:tcPr>
+          <w:p>
+            <w:r>
+              <w:rPr>
+                <w:sz w:val="16"/>
+              </w:rPr>
+              <w:t>geographical</w:t>
+            </w:r>
+          </w:p>
+        </w:tc>
+        <w:tc>
+          <w:tcPr>
+            <w:tcW w:type="dxa" w:w="1560"/>
+          </w:tcPr>
+          <w:p>
+            <w:r>
+              <w:rPr>
+                <w:sz w:val="16"/>
+              </w:rPr>
+              <w:t>71.9%</w:t>
+            </w:r>
+          </w:p>
+        </w:tc>
+        <w:tc>
+          <w:tcPr>
+            <w:tcW w:type="dxa" w:w="1560"/>
+          </w:tcPr>
+          <w:p>
+            <w:r>
+              <w:rPr>
+                <w:sz w:val="16"/>
+              </w:rPr>
+              <w:t>68.6%</w:t>
+            </w:r>
+          </w:p>
+        </w:tc>
+        <w:tc>
+          <w:tcPr>
+            <w:tcW w:type="dxa" w:w="1560"/>
+          </w:tcPr>
+          <w:p>
+            <w:r>
+              <w:rPr>
+                <w:sz w:val="16"/>
+              </w:rPr>
+            </w:r>
+          </w:p>
+        </w:tc>
+      </w:tr>
+      <w:tr>
+        <w:tc>
+          <w:tcPr>
+            <w:tcW w:type="dxa" w:w="1560"/>
+          </w:tcPr>
+          <w:p>
+            <w:r>
+              <w:rPr>
+                <w:sz w:val="16"/>
+              </w:rPr>
+              <w:t>Chernigov</w:t>
+            </w:r>
+          </w:p>
+        </w:tc>
+        <w:tc>
+          <w:tcPr>
+            <w:tcW w:type="dxa" w:w="1560"/>
+          </w:tcPr>
+          <w:p>
+            <w:r>
+              <w:rPr>
+                <w:sz w:val="16"/>
+              </w:rPr>
+              <w:t>Chernihiv</w:t>
+            </w:r>
+          </w:p>
+        </w:tc>
+        <w:tc>
+          <w:tcPr>
+            <w:tcW w:type="dxa" w:w="1560"/>
+          </w:tcPr>
+          <w:p>
+            <w:r>
+              <w:rPr>
+                <w:sz w:val="16"/>
+              </w:rPr>
+              <w:t>geographical</w:t>
+            </w:r>
+          </w:p>
+        </w:tc>
+        <w:tc>
+          <w:tcPr>
+            <w:tcW w:type="dxa" w:w="1560"/>
+          </w:tcPr>
+          <w:p>
+            <w:r>
+              <w:rPr>
+                <w:sz w:val="16"/>
+              </w:rPr>
+              <w:t>71.5%</w:t>
+            </w:r>
+          </w:p>
+        </w:tc>
+        <w:tc>
+          <w:tcPr>
+            <w:tcW w:type="dxa" w:w="1560"/>
+          </w:tcPr>
+          <w:p>
+            <w:r>
+              <w:rPr>
+                <w:sz w:val="16"/>
+              </w:rPr>
+              <w:t>73.6%</w:t>
+            </w:r>
+          </w:p>
+        </w:tc>
+        <w:tc>
+          <w:tcPr>
+            <w:tcW w:type="dxa" w:w="1560"/>
+          </w:tcPr>
+          <w:p>
+            <w:r>
+              <w:rPr>
+                <w:sz w:val="16"/>
+              </w:rPr>
+            </w:r>
+          </w:p>
+        </w:tc>
+      </w:tr>
+      <w:tr>
+        <w:tc>
+          <w:tcPr>
+            <w:tcW w:type="dxa" w:w="1560"/>
+          </w:tcPr>
+          <w:p>
+            <w:r>
+              <w:rPr>
+                <w:sz w:val="16"/>
+              </w:rPr>
+              <w:t>Zaporozhye</w:t>
+            </w:r>
+          </w:p>
+        </w:tc>
+        <w:tc>
+          <w:tcPr>
+            <w:tcW w:type="dxa" w:w="1560"/>
+          </w:tcPr>
+          <w:p>
+            <w:r>
+              <w:rPr>
+                <w:sz w:val="16"/>
+              </w:rPr>
+              <w:t>Zaporizhzhia</w:t>
+            </w:r>
+          </w:p>
+        </w:tc>
+        <w:tc>
+          <w:tcPr>
+            <w:tcW w:type="dxa" w:w="1560"/>
+          </w:tcPr>
+          <w:p>
+            <w:r>
+              <w:rPr>
+                <w:sz w:val="16"/>
+              </w:rPr>
+              <w:t>geographical</w:t>
+            </w:r>
+          </w:p>
+        </w:tc>
+        <w:tc>
+          <w:tcPr>
+            <w:tcW w:type="dxa" w:w="1560"/>
+          </w:tcPr>
+          <w:p>
+            <w:r>
+              <w:rPr>
+                <w:sz w:val="16"/>
+              </w:rPr>
+              <w:t>70.6%</w:t>
+            </w:r>
+          </w:p>
+        </w:tc>
+        <w:tc>
+          <w:tcPr>
+            <w:tcW w:type="dxa" w:w="1560"/>
+          </w:tcPr>
+          <w:p>
+            <w:r>
+              <w:rPr>
+                <w:sz w:val="16"/>
+              </w:rPr>
+              <w:t>58.3%</w:t>
+            </w:r>
+          </w:p>
+        </w:tc>
+        <w:tc>
+          <w:tcPr>
+            <w:tcW w:type="dxa" w:w="1560"/>
+          </w:tcPr>
+          <w:p>
+            <w:r>
+              <w:rPr>
+                <w:sz w:val="16"/>
+              </w:rPr>
+            </w:r>
+          </w:p>
+        </w:tc>
+      </w:tr>
+      <w:tr>
+        <w:tc>
+          <w:tcPr>
+            <w:tcW w:type="dxa" w:w="1560"/>
+          </w:tcPr>
+          <w:p>
+            <w:r>
+              <w:rPr>
+                <w:sz w:val="16"/>
+              </w:rPr>
+              <w:t>Vinnitsa</w:t>
+            </w:r>
+          </w:p>
+        </w:tc>
+        <w:tc>
+          <w:tcPr>
+            <w:tcW w:type="dxa" w:w="1560"/>
+          </w:tcPr>
+          <w:p>
+            <w:r>
+              <w:rPr>
+                <w:sz w:val="16"/>
+              </w:rPr>
+              <w:t>Vinnytsia</w:t>
+            </w:r>
+          </w:p>
+        </w:tc>
+        <w:tc>
+          <w:tcPr>
+            <w:tcW w:type="dxa" w:w="1560"/>
+          </w:tcPr>
+          <w:p>
+            <w:r>
+              <w:rPr>
+                <w:sz w:val="16"/>
+              </w:rPr>
+              <w:t>geographical</w:t>
+            </w:r>
+          </w:p>
+        </w:tc>
+        <w:tc>
+          <w:tcPr>
+            <w:tcW w:type="dxa" w:w="1560"/>
+          </w:tcPr>
+          <w:p>
+            <w:r>
+              <w:rPr>
+                <w:sz w:val="16"/>
+              </w:rPr>
+              <w:t>62.8%</w:t>
+            </w:r>
+          </w:p>
+        </w:tc>
+        <w:tc>
+          <w:tcPr>
+            <w:tcW w:type="dxa" w:w="1560"/>
+          </w:tcPr>
+          <w:p>
+            <w:r>
+              <w:rPr>
+                <w:sz w:val="16"/>
+              </w:rPr>
+              <w:t>60.9%</w:t>
+            </w:r>
+          </w:p>
+        </w:tc>
+        <w:tc>
+          <w:tcPr>
+            <w:tcW w:type="dxa" w:w="1560"/>
+          </w:tcPr>
+          <w:p>
+            <w:r>
+              <w:rPr>
+                <w:sz w:val="16"/>
+              </w:rPr>
+            </w:r>
+          </w:p>
+        </w:tc>
+      </w:tr>
+      <w:tr>
+        <w:tc>
+          <w:tcPr>
+            <w:tcW w:type="dxa" w:w="1560"/>
+          </w:tcPr>
+          <w:p>
+            <w:r>
+              <w:rPr>
+                <w:sz w:val="16"/>
+              </w:rPr>
+              <w:t>Kremenchug</w:t>
+            </w:r>
+          </w:p>
+        </w:tc>
+        <w:tc>
+          <w:tcPr>
+            <w:tcW w:type="dxa" w:w="1560"/>
+          </w:tcPr>
+          <w:p>
+            <w:r>
+              <w:rPr>
+                <w:sz w:val="16"/>
+              </w:rPr>
+              <w:t>Kremenchuk</w:t>
+            </w:r>
+          </w:p>
+        </w:tc>
+        <w:tc>
+          <w:tcPr>
+            <w:tcW w:type="dxa" w:w="1560"/>
+          </w:tcPr>
+          <w:p>
+            <w:r>
+              <w:rPr>
+                <w:sz w:val="16"/>
+              </w:rPr>
+              <w:t>geographical</w:t>
+            </w:r>
+          </w:p>
+        </w:tc>
+        <w:tc>
+          <w:tcPr>
+            <w:tcW w:type="dxa" w:w="1560"/>
+          </w:tcPr>
+          <w:p>
+            <w:r>
+              <w:rPr>
+                <w:sz w:val="16"/>
+              </w:rPr>
+              <w:t>62.2%</w:t>
+            </w:r>
+          </w:p>
+        </w:tc>
+        <w:tc>
+          <w:tcPr>
+            <w:tcW w:type="dxa" w:w="1560"/>
+          </w:tcPr>
+          <w:p>
+            <w:r>
+              <w:rPr>
+                <w:sz w:val="16"/>
+              </w:rPr>
+              <w:t>63.9%</w:t>
+            </w:r>
+          </w:p>
+        </w:tc>
+        <w:tc>
+          <w:tcPr>
+            <w:tcW w:type="dxa" w:w="1560"/>
+          </w:tcPr>
+          <w:p>
+            <w:r>
+              <w:rPr>
+                <w:sz w:val="16"/>
+              </w:rPr>
+            </w:r>
+          </w:p>
+        </w:tc>
+      </w:tr>
+      <w:tr>
+        <w:tc>
+          <w:tcPr>
+            <w:tcW w:type="dxa" w:w="1560"/>
+          </w:tcPr>
+          <w:p>
+            <w:r>
+              <w:rPr>
+                <w:sz w:val="16"/>
+              </w:rPr>
+              <w:t>Uzhgorod</w:t>
+            </w:r>
+          </w:p>
+        </w:tc>
+        <w:tc>
+          <w:tcPr>
+            <w:tcW w:type="dxa" w:w="1560"/>
+          </w:tcPr>
+          <w:p>
+            <w:r>
+              <w:rPr>
+                <w:sz w:val="16"/>
+              </w:rPr>
+              <w:t>Uzhhorod</w:t>
+            </w:r>
+          </w:p>
+        </w:tc>
+        <w:tc>
+          <w:tcPr>
+            <w:tcW w:type="dxa" w:w="1560"/>
+          </w:tcPr>
+          <w:p>
+            <w:r>
+              <w:rPr>
+                <w:sz w:val="16"/>
+              </w:rPr>
+              <w:t>geographical</w:t>
+            </w:r>
+          </w:p>
+        </w:tc>
+        <w:tc>
+          <w:tcPr>
+            <w:tcW w:type="dxa" w:w="1560"/>
+          </w:tcPr>
+          <w:p>
+            <w:r>
+              <w:rPr>
+                <w:sz w:val="16"/>
+              </w:rPr>
+              <w:t>60.8%</w:t>
+            </w:r>
+          </w:p>
+        </w:tc>
+        <w:tc>
+          <w:tcPr>
+            <w:tcW w:type="dxa" w:w="1560"/>
+          </w:tcPr>
+          <w:p>
+            <w:r>
+              <w:rPr>
+                <w:sz w:val="16"/>
+              </w:rPr>
+              <w:t>56.0%</w:t>
+            </w:r>
+          </w:p>
+        </w:tc>
+        <w:tc>
+          <w:tcPr>
+            <w:tcW w:type="dxa" w:w="1560"/>
+          </w:tcPr>
+          <w:p>
+            <w:r>
+              <w:rPr>
+                <w:sz w:val="16"/>
+              </w:rPr>
+            </w:r>
+          </w:p>
+        </w:tc>
+      </w:tr>
+      <w:tr>
+        <w:tc>
+          <w:tcPr>
+            <w:tcW w:type="dxa" w:w="1560"/>
+          </w:tcPr>
+          <w:p>
+            <w:r>
+              <w:rPr>
+                <w:sz w:val="16"/>
+              </w:rPr>
+              <w:t>Kiev</w:t>
+            </w:r>
+          </w:p>
+        </w:tc>
+        <w:tc>
+          <w:tcPr>
+            <w:tcW w:type="dxa" w:w="1560"/>
+          </w:tcPr>
+          <w:p>
+            <w:r>
+              <w:rPr>
+                <w:sz w:val="16"/>
+              </w:rPr>
+              <w:t>Kyiv</w:t>
+            </w:r>
+          </w:p>
+        </w:tc>
+        <w:tc>
+          <w:tcPr>
+            <w:tcW w:type="dxa" w:w="1560"/>
+          </w:tcPr>
+          <w:p>
+            <w:r>
+              <w:rPr>
+                <w:sz w:val="16"/>
+              </w:rPr>
+              <w:t>geographical</w:t>
+            </w:r>
+          </w:p>
+        </w:tc>
+        <w:tc>
+          <w:tcPr>
+            <w:tcW w:type="dxa" w:w="1560"/>
+          </w:tcPr>
+          <w:p>
+            <w:r>
+              <w:rPr>
+                <w:sz w:val="16"/>
+              </w:rPr>
+              <w:t>60.3%</w:t>
+            </w:r>
+          </w:p>
+        </w:tc>
+        <w:tc>
+          <w:tcPr>
+            <w:tcW w:type="dxa" w:w="1560"/>
+          </w:tcPr>
+          <w:p>
+            <w:r>
+              <w:rPr>
+                <w:sz w:val="16"/>
+              </w:rPr>
+              <w:t>50.0%</w:t>
+            </w:r>
+          </w:p>
+        </w:tc>
+        <w:tc>
+          <w:tcPr>
+            <w:tcW w:type="dxa" w:w="1560"/>
+          </w:tcPr>
+          <w:p>
+            <w:r>
+              <w:rPr>
+                <w:sz w:val="16"/>
+              </w:rPr>
+              <w:t>★</w:t>
+            </w:r>
+          </w:p>
+        </w:tc>
+      </w:tr>
+      <w:tr>
+        <w:tc>
+          <w:tcPr>
+            <w:tcW w:type="dxa" w:w="1560"/>
+          </w:tcPr>
+          <w:p>
+            <w:r>
+              <w:rPr>
+                <w:sz w:val="16"/>
+              </w:rPr>
+              <w:t>Dnieper</w:t>
+            </w:r>
+          </w:p>
+        </w:tc>
+        <w:tc>
+          <w:tcPr>
+            <w:tcW w:type="dxa" w:w="1560"/>
+          </w:tcPr>
+          <w:p>
+            <w:r>
+              <w:rPr>
+                <w:sz w:val="16"/>
+              </w:rPr>
+              <w:t>Dnipro</w:t>
+            </w:r>
+          </w:p>
+        </w:tc>
+        <w:tc>
+          <w:tcPr>
+            <w:tcW w:type="dxa" w:w="1560"/>
+          </w:tcPr>
+          <w:p>
+            <w:r>
+              <w:rPr>
+                <w:sz w:val="16"/>
+              </w:rPr>
+              <w:t>geographical</w:t>
+            </w:r>
+          </w:p>
+        </w:tc>
+        <w:tc>
+          <w:tcPr>
+            <w:tcW w:type="dxa" w:w="1560"/>
+          </w:tcPr>
+          <w:p>
+            <w:r>
+              <w:rPr>
+                <w:sz w:val="16"/>
+              </w:rPr>
+              <w:t>60.1%</w:t>
+            </w:r>
+          </w:p>
+        </w:tc>
+        <w:tc>
+          <w:tcPr>
+            <w:tcW w:type="dxa" w:w="1560"/>
+          </w:tcPr>
+          <w:p>
+            <w:r>
+              <w:rPr>
+                <w:sz w:val="16"/>
+              </w:rPr>
+              <w:t>56.7%</w:t>
+            </w:r>
+          </w:p>
+        </w:tc>
+        <w:tc>
+          <w:tcPr>
+            <w:tcW w:type="dxa" w:w="1560"/>
+          </w:tcPr>
+          <w:p>
+            <w:r>
+              <w:rPr>
+                <w:sz w:val="16"/>
+              </w:rPr>
+            </w:r>
+          </w:p>
+        </w:tc>
+      </w:tr>
+      <w:tr>
+        <w:tc>
+          <w:tcPr>
+            <w:tcW w:type="dxa" w:w="1560"/>
+          </w:tcPr>
+          <w:p>
+            <w:r>
+              <w:rPr>
+                <w:sz w:val="16"/>
+              </w:rPr>
+              <w:t>Podolye</w:t>
+            </w:r>
+          </w:p>
+        </w:tc>
+        <w:tc>
+          <w:tcPr>
+            <w:tcW w:type="dxa" w:w="1560"/>
+          </w:tcPr>
+          <w:p>
+            <w:r>
+              <w:rPr>
+                <w:sz w:val="16"/>
+              </w:rPr>
+              <w:t>Podillia</w:t>
+            </w:r>
+          </w:p>
+        </w:tc>
+        <w:tc>
+          <w:tcPr>
+            <w:tcW w:type="dxa" w:w="1560"/>
+          </w:tcPr>
+          <w:p>
+            <w:r>
+              <w:rPr>
+                <w:sz w:val="16"/>
+              </w:rPr>
+              <w:t>geographical</w:t>
+            </w:r>
+          </w:p>
+        </w:tc>
+        <w:tc>
+          <w:tcPr>
+            <w:tcW w:type="dxa" w:w="1560"/>
+          </w:tcPr>
+          <w:p>
+            <w:r>
+              <w:rPr>
+                <w:sz w:val="16"/>
+              </w:rPr>
+              <w:t>58.5%</w:t>
+            </w:r>
+          </w:p>
+        </w:tc>
+        <w:tc>
+          <w:tcPr>
+            <w:tcW w:type="dxa" w:w="1560"/>
+          </w:tcPr>
+          <w:p>
+            <w:r>
+              <w:rPr>
+                <w:sz w:val="16"/>
+              </w:rPr>
+              <w:t>70.0%</w:t>
+            </w:r>
+          </w:p>
+        </w:tc>
+        <w:tc>
+          <w:tcPr>
+            <w:tcW w:type="dxa" w:w="1560"/>
+          </w:tcPr>
+          <w:p>
+            <w:r>
+              <w:rPr>
+                <w:sz w:val="16"/>
+              </w:rPr>
+            </w:r>
+          </w:p>
+        </w:tc>
+      </w:tr>
+      <w:tr>
+        <w:tc>
+          <w:tcPr>
+            <w:tcW w:type="dxa" w:w="1560"/>
+          </w:tcPr>
+          <w:p>
+            <w:r>
+              <w:rPr>
+                <w:sz w:val="16"/>
+              </w:rPr>
+              <w:t>Kirovograd</w:t>
+            </w:r>
+          </w:p>
+        </w:tc>
+        <w:tc>
+          <w:tcPr>
+            <w:tcW w:type="dxa" w:w="1560"/>
+          </w:tcPr>
+          <w:p>
+            <w:r>
+              <w:rPr>
+                <w:sz w:val="16"/>
+              </w:rPr>
+              <w:t>Kropyvnytskyi</w:t>
+            </w:r>
+          </w:p>
+        </w:tc>
+        <w:tc>
+          <w:tcPr>
+            <w:tcW w:type="dxa" w:w="1560"/>
+          </w:tcPr>
+          <w:p>
+            <w:r>
+              <w:rPr>
+                <w:sz w:val="16"/>
+              </w:rPr>
+              <w:t>geographical</w:t>
+            </w:r>
+          </w:p>
+        </w:tc>
+        <w:tc>
+          <w:tcPr>
+            <w:tcW w:type="dxa" w:w="1560"/>
+          </w:tcPr>
+          <w:p>
+            <w:r>
+              <w:rPr>
+                <w:sz w:val="16"/>
+              </w:rPr>
+              <w:t>58.4%</w:t>
+            </w:r>
+          </w:p>
+        </w:tc>
+        <w:tc>
+          <w:tcPr>
+            <w:tcW w:type="dxa" w:w="1560"/>
+          </w:tcPr>
+          <w:p>
+            <w:r>
+              <w:rPr>
+                <w:sz w:val="16"/>
+              </w:rPr>
+              <w:t>47.3%</w:t>
+            </w:r>
+          </w:p>
+        </w:tc>
+        <w:tc>
+          <w:tcPr>
+            <w:tcW w:type="dxa" w:w="1560"/>
+          </w:tcPr>
+          <w:p>
+            <w:r>
+              <w:rPr>
+                <w:sz w:val="16"/>
+              </w:rPr>
+            </w:r>
+          </w:p>
+        </w:tc>
+      </w:tr>
+      <w:tr>
+        <w:tc>
+          <w:tcPr>
+            <w:tcW w:type="dxa" w:w="1560"/>
+          </w:tcPr>
+          <w:p>
+            <w:r>
+              <w:rPr>
+                <w:sz w:val="16"/>
+              </w:rPr>
+              <w:t>Donbass</w:t>
+            </w:r>
+          </w:p>
+        </w:tc>
+        <w:tc>
+          <w:tcPr>
+            <w:tcW w:type="dxa" w:w="1560"/>
+          </w:tcPr>
+          <w:p>
+            <w:r>
+              <w:rPr>
+                <w:sz w:val="16"/>
+              </w:rPr>
+              <w:t>Donbas</w:t>
+            </w:r>
+          </w:p>
+        </w:tc>
+        <w:tc>
+          <w:tcPr>
+            <w:tcW w:type="dxa" w:w="1560"/>
+          </w:tcPr>
+          <w:p>
+            <w:r>
+              <w:rPr>
+                <w:sz w:val="16"/>
+              </w:rPr>
+              <w:t>geographical</w:t>
+            </w:r>
+          </w:p>
+        </w:tc>
+        <w:tc>
+          <w:tcPr>
+            <w:tcW w:type="dxa" w:w="1560"/>
+          </w:tcPr>
+          <w:p>
+            <w:r>
+              <w:rPr>
+                <w:sz w:val="16"/>
+              </w:rPr>
+              <w:t>54.1%</w:t>
+            </w:r>
+          </w:p>
+        </w:tc>
+        <w:tc>
+          <w:tcPr>
+            <w:tcW w:type="dxa" w:w="1560"/>
+          </w:tcPr>
+          <w:p>
+            <w:r>
+              <w:rPr>
+                <w:sz w:val="16"/>
+              </w:rPr>
+              <w:t>43.4%</w:t>
+            </w:r>
+          </w:p>
+        </w:tc>
+        <w:tc>
+          <w:tcPr>
+            <w:tcW w:type="dxa" w:w="1560"/>
+          </w:tcPr>
+          <w:p>
+            <w:r>
+              <w:rPr>
+                <w:sz w:val="16"/>
+              </w:rPr>
+            </w:r>
+          </w:p>
+        </w:tc>
+      </w:tr>
+      <w:tr>
+        <w:tc>
+          <w:tcPr>
+            <w:tcW w:type="dxa" w:w="1560"/>
+          </w:tcPr>
+          <w:p>
+            <w:r>
+              <w:rPr>
+                <w:sz w:val="16"/>
+              </w:rPr>
+              <w:t>Nikolaev</w:t>
+            </w:r>
+          </w:p>
+        </w:tc>
+        <w:tc>
+          <w:tcPr>
+            <w:tcW w:type="dxa" w:w="1560"/>
+          </w:tcPr>
+          <w:p>
+            <w:r>
+              <w:rPr>
+                <w:sz w:val="16"/>
+              </w:rPr>
+              <w:t>Mykolaiv</w:t>
+            </w:r>
+          </w:p>
+        </w:tc>
+        <w:tc>
+          <w:tcPr>
+            <w:tcW w:type="dxa" w:w="1560"/>
+          </w:tcPr>
+          <w:p>
+            <w:r>
+              <w:rPr>
+                <w:sz w:val="16"/>
+              </w:rPr>
+              <w:t>geographical</w:t>
+            </w:r>
+          </w:p>
+        </w:tc>
+        <w:tc>
+          <w:tcPr>
+            <w:tcW w:type="dxa" w:w="1560"/>
+          </w:tcPr>
+          <w:p>
+            <w:r>
+              <w:rPr>
+                <w:sz w:val="16"/>
+              </w:rPr>
+              <w:t>49.3%</w:t>
+            </w:r>
+          </w:p>
+        </w:tc>
+        <w:tc>
+          <w:tcPr>
+            <w:tcW w:type="dxa" w:w="1560"/>
+          </w:tcPr>
+          <w:p>
+            <w:r>
+              <w:rPr>
+                <w:sz w:val="16"/>
+              </w:rPr>
+              <w:t>50.2%</w:t>
+            </w:r>
+          </w:p>
+        </w:tc>
+        <w:tc>
+          <w:tcPr>
+            <w:tcW w:type="dxa" w:w="1560"/>
+          </w:tcPr>
+          <w:p>
+            <w:r>
+              <w:rPr>
+                <w:sz w:val="16"/>
+              </w:rPr>
+            </w:r>
+          </w:p>
+        </w:tc>
+      </w:tr>
+      <w:tr>
+        <w:tc>
+          <w:tcPr>
+            <w:tcW w:type="dxa" w:w="1560"/>
+          </w:tcPr>
+          <w:p>
+            <w:r>
+              <w:rPr>
+                <w:sz w:val="16"/>
+              </w:rPr>
+              <w:t>Odessa</w:t>
+            </w:r>
+          </w:p>
+        </w:tc>
+        <w:tc>
+          <w:tcPr>
+            <w:tcW w:type="dxa" w:w="1560"/>
+          </w:tcPr>
+          <w:p>
+            <w:r>
+              <w:rPr>
+                <w:sz w:val="16"/>
+              </w:rPr>
+              <w:t>Odesa</w:t>
+            </w:r>
+          </w:p>
+        </w:tc>
+        <w:tc>
+          <w:tcPr>
+            <w:tcW w:type="dxa" w:w="1560"/>
+          </w:tcPr>
+          <w:p>
+            <w:r>
+              <w:rPr>
+                <w:sz w:val="16"/>
+              </w:rPr>
+              <w:t>geographical</w:t>
+            </w:r>
+          </w:p>
+        </w:tc>
+        <w:tc>
+          <w:tcPr>
+            <w:tcW w:type="dxa" w:w="1560"/>
+          </w:tcPr>
+          <w:p>
+            <w:r>
+              <w:rPr>
+                <w:sz w:val="16"/>
+              </w:rPr>
+              <w:t>43.2%</w:t>
+            </w:r>
+          </w:p>
+        </w:tc>
+        <w:tc>
+          <w:tcPr>
+            <w:tcW w:type="dxa" w:w="1560"/>
+          </w:tcPr>
+          <w:p>
+            <w:r>
+              <w:rPr>
+                <w:sz w:val="16"/>
+              </w:rPr>
+              <w:t>29.0%</w:t>
+            </w:r>
+          </w:p>
+        </w:tc>
+        <w:tc>
+          <w:tcPr>
+            <w:tcW w:type="dxa" w:w="1560"/>
+          </w:tcPr>
+          <w:p>
+            <w:r>
+              <w:rPr>
+                <w:sz w:val="16"/>
+              </w:rPr>
+              <w:t>★</w:t>
+            </w:r>
+          </w:p>
+        </w:tc>
+      </w:tr>
+      <w:tr>
+        <w:tc>
+          <w:tcPr>
+            <w:tcW w:type="dxa" w:w="1560"/>
+          </w:tcPr>
+          <w:p>
+            <w:r>
+              <w:rPr>
+                <w:sz w:val="16"/>
+              </w:rPr>
+              <w:t>Dniester</w:t>
+            </w:r>
+          </w:p>
+        </w:tc>
+        <w:tc>
+          <w:tcPr>
+            <w:tcW w:type="dxa" w:w="1560"/>
+          </w:tcPr>
+          <w:p>
+            <w:r>
+              <w:rPr>
+                <w:sz w:val="16"/>
+              </w:rPr>
+              <w:t>Dnister</w:t>
+            </w:r>
+          </w:p>
+        </w:tc>
+        <w:tc>
+          <w:tcPr>
+            <w:tcW w:type="dxa" w:w="1560"/>
+          </w:tcPr>
+          <w:p>
+            <w:r>
+              <w:rPr>
+                <w:sz w:val="16"/>
+              </w:rPr>
+              <w:t>geographical</w:t>
+            </w:r>
+          </w:p>
+        </w:tc>
+        <w:tc>
+          <w:tcPr>
+            <w:tcW w:type="dxa" w:w="1560"/>
+          </w:tcPr>
+          <w:p>
+            <w:r>
+              <w:rPr>
+                <w:sz w:val="16"/>
+              </w:rPr>
+              <w:t>36.7%</w:t>
+            </w:r>
+          </w:p>
+        </w:tc>
+        <w:tc>
+          <w:tcPr>
+            <w:tcW w:type="dxa" w:w="1560"/>
+          </w:tcPr>
+          <w:p>
+            <w:r>
+              <w:rPr>
+                <w:sz w:val="16"/>
+              </w:rPr>
+              <w:t>38.2%</w:t>
+            </w:r>
+          </w:p>
+        </w:tc>
+        <w:tc>
+          <w:tcPr>
+            <w:tcW w:type="dxa" w:w="1560"/>
+          </w:tcPr>
+          <w:p>
+            <w:r>
+              <w:rPr>
+                <w:sz w:val="16"/>
+              </w:rPr>
+            </w:r>
+          </w:p>
+        </w:tc>
+      </w:tr>
+      <w:tr>
+        <w:tc>
+          <w:tcPr>
+            <w:tcW w:type="dxa" w:w="1560"/>
+          </w:tcPr>
+          <w:p>
+            <w:r>
+              <w:rPr>
+                <w:sz w:val="16"/>
+              </w:rPr>
+              <w:t>Chernobyl</w:t>
+            </w:r>
+          </w:p>
+        </w:tc>
+        <w:tc>
+          <w:tcPr>
+            <w:tcW w:type="dxa" w:w="1560"/>
+          </w:tcPr>
+          <w:p>
+            <w:r>
+              <w:rPr>
+                <w:sz w:val="16"/>
+              </w:rPr>
+              <w:t>Chornobyl</w:t>
+            </w:r>
+          </w:p>
+        </w:tc>
+        <w:tc>
+          <w:tcPr>
+            <w:tcW w:type="dxa" w:w="1560"/>
+          </w:tcPr>
+          <w:p>
+            <w:r>
+              <w:rPr>
+                <w:sz w:val="16"/>
+              </w:rPr>
+              <w:t>geographical</w:t>
+            </w:r>
+          </w:p>
+        </w:tc>
+        <w:tc>
+          <w:tcPr>
+            <w:tcW w:type="dxa" w:w="1560"/>
+          </w:tcPr>
+          <w:p>
+            <w:r>
+              <w:rPr>
+                <w:sz w:val="16"/>
+              </w:rPr>
+              <w:t>26.8%</w:t>
+            </w:r>
+          </w:p>
+        </w:tc>
+        <w:tc>
+          <w:tcPr>
+            <w:tcW w:type="dxa" w:w="1560"/>
+          </w:tcPr>
+          <w:p>
+            <w:r>
+              <w:rPr>
+                <w:sz w:val="16"/>
+              </w:rPr>
+              <w:t>18.1%</w:t>
+            </w:r>
+          </w:p>
+        </w:tc>
+        <w:tc>
+          <w:tcPr>
+            <w:tcW w:type="dxa" w:w="1560"/>
+          </w:tcPr>
+          <w:p>
+            <w:r>
+              <w:rPr>
+                <w:sz w:val="16"/>
+              </w:rPr>
+              <w:t>★</w:t>
+            </w:r>
+          </w:p>
+        </w:tc>
+      </w:tr>
+      <w:tr>
+        <w:tc>
+          <w:tcPr>
+            <w:tcW w:type="dxa" w:w="1560"/>
+          </w:tcPr>
+          <w:p>
+            <w:r>
+              <w:rPr>
+                <w:sz w:val="16"/>
+              </w:rPr>
+              <w:t>Gopak</w:t>
+            </w:r>
+          </w:p>
+        </w:tc>
+        <w:tc>
+          <w:tcPr>
+            <w:tcW w:type="dxa" w:w="1560"/>
+          </w:tcPr>
+          <w:p>
+            <w:r>
+              <w:rPr>
+                <w:sz w:val="16"/>
+              </w:rPr>
+              <w:t>Hopak</w:t>
+            </w:r>
+          </w:p>
+        </w:tc>
+        <w:tc>
+          <w:tcPr>
+            <w:tcW w:type="dxa" w:w="1560"/>
+          </w:tcPr>
+          <w:p>
+            <w:r>
+              <w:rPr>
+                <w:sz w:val="16"/>
+              </w:rPr>
+              <w:t>historical</w:t>
+            </w:r>
+          </w:p>
+        </w:tc>
+        <w:tc>
+          <w:tcPr>
+            <w:tcW w:type="dxa" w:w="1560"/>
+          </w:tcPr>
+          <w:p>
+            <w:r>
+              <w:rPr>
+                <w:sz w:val="16"/>
+              </w:rPr>
+              <w:t>70.2%</w:t>
+            </w:r>
+          </w:p>
+        </w:tc>
+        <w:tc>
+          <w:tcPr>
+            <w:tcW w:type="dxa" w:w="1560"/>
+          </w:tcPr>
+          <w:p>
+            <w:r>
+              <w:rPr>
+                <w:sz w:val="16"/>
+              </w:rPr>
+              <w:t>66.6%</w:t>
+            </w:r>
+          </w:p>
+        </w:tc>
+        <w:tc>
+          <w:tcPr>
+            <w:tcW w:type="dxa" w:w="1560"/>
+          </w:tcPr>
+          <w:p>
+            <w:r>
+              <w:rPr>
+                <w:sz w:val="16"/>
+              </w:rPr>
+            </w:r>
+          </w:p>
+        </w:tc>
+      </w:tr>
+      <w:tr>
+        <w:tc>
+          <w:tcPr>
+            <w:tcW w:type="dxa" w:w="1560"/>
+          </w:tcPr>
+          <w:p>
+            <w:r>
+              <w:rPr>
+                <w:sz w:val="16"/>
+              </w:rPr>
+              <w:t>Kazak</w:t>
+            </w:r>
+          </w:p>
+        </w:tc>
+        <w:tc>
+          <w:tcPr>
+            <w:tcW w:type="dxa" w:w="1560"/>
+          </w:tcPr>
+          <w:p>
+            <w:r>
+              <w:rPr>
+                <w:sz w:val="16"/>
+              </w:rPr>
+              <w:t>Kozak</w:t>
+            </w:r>
+          </w:p>
+        </w:tc>
+        <w:tc>
+          <w:tcPr>
+            <w:tcW w:type="dxa" w:w="1560"/>
+          </w:tcPr>
+          <w:p>
+            <w:r>
+              <w:rPr>
+                <w:sz w:val="16"/>
+              </w:rPr>
+              <w:t>historical</w:t>
+            </w:r>
+          </w:p>
+        </w:tc>
+        <w:tc>
+          <w:tcPr>
+            <w:tcW w:type="dxa" w:w="1560"/>
+          </w:tcPr>
+          <w:p>
+            <w:r>
+              <w:rPr>
+                <w:sz w:val="16"/>
+              </w:rPr>
+              <w:t>50.2%</w:t>
+            </w:r>
+          </w:p>
+        </w:tc>
+        <w:tc>
+          <w:tcPr>
+            <w:tcW w:type="dxa" w:w="1560"/>
+          </w:tcPr>
+          <w:p>
+            <w:r>
+              <w:rPr>
+                <w:sz w:val="16"/>
+              </w:rPr>
+              <w:t>47.8%</w:t>
+            </w:r>
+          </w:p>
+        </w:tc>
+        <w:tc>
+          <w:tcPr>
+            <w:tcW w:type="dxa" w:w="1560"/>
+          </w:tcPr>
+          <w:p>
+            <w:r>
+              <w:rPr>
+                <w:sz w:val="16"/>
+              </w:rPr>
+            </w:r>
+          </w:p>
+        </w:tc>
+      </w:tr>
+      <w:tr>
+        <w:tc>
+          <w:tcPr>
+            <w:tcW w:type="dxa" w:w="1560"/>
+          </w:tcPr>
+          <w:p>
+            <w:r>
+              <w:rPr>
+                <w:sz w:val="16"/>
+              </w:rPr>
+              <w:t>Kievan Rus</w:t>
+            </w:r>
+          </w:p>
+        </w:tc>
+        <w:tc>
+          <w:tcPr>
+            <w:tcW w:type="dxa" w:w="1560"/>
+          </w:tcPr>
+          <w:p>
+            <w:r>
+              <w:rPr>
+                <w:sz w:val="16"/>
+              </w:rPr>
+              <w:t>Kyivan Rus</w:t>
+            </w:r>
+          </w:p>
+        </w:tc>
+        <w:tc>
+          <w:tcPr>
+            <w:tcW w:type="dxa" w:w="1560"/>
+          </w:tcPr>
+          <w:p>
+            <w:r>
+              <w:rPr>
+                <w:sz w:val="16"/>
+              </w:rPr>
+              <w:t>historical</w:t>
+            </w:r>
+          </w:p>
+        </w:tc>
+        <w:tc>
+          <w:tcPr>
+            <w:tcW w:type="dxa" w:w="1560"/>
+          </w:tcPr>
+          <w:p>
+            <w:r>
+              <w:rPr>
+                <w:sz w:val="16"/>
+              </w:rPr>
+              <w:t>49.8%</w:t>
+            </w:r>
+          </w:p>
+        </w:tc>
+        <w:tc>
+          <w:tcPr>
+            <w:tcW w:type="dxa" w:w="1560"/>
+          </w:tcPr>
+          <w:p>
+            <w:r>
+              <w:rPr>
+                <w:sz w:val="16"/>
+              </w:rPr>
+              <w:t>42.5%</w:t>
+            </w:r>
+          </w:p>
+        </w:tc>
+        <w:tc>
+          <w:tcPr>
+            <w:tcW w:type="dxa" w:w="1560"/>
+          </w:tcPr>
+          <w:p>
+            <w:r>
+              <w:rPr>
+                <w:sz w:val="16"/>
+              </w:rPr>
+            </w:r>
+          </w:p>
+        </w:tc>
+      </w:tr>
+      <w:tr>
+        <w:tc>
+          <w:tcPr>
+            <w:tcW w:type="dxa" w:w="1560"/>
+          </w:tcPr>
+          <w:p>
+            <w:r>
+              <w:rPr>
+                <w:sz w:val="16"/>
+              </w:rPr>
+              <w:t>Prince of Kiev</w:t>
+            </w:r>
+          </w:p>
+        </w:tc>
+        <w:tc>
+          <w:tcPr>
+            <w:tcW w:type="dxa" w:w="1560"/>
+          </w:tcPr>
+          <w:p>
+            <w:r>
+              <w:rPr>
+                <w:sz w:val="16"/>
+              </w:rPr>
+              <w:t>Prince of Kyiv</w:t>
+            </w:r>
+          </w:p>
+        </w:tc>
+        <w:tc>
+          <w:tcPr>
+            <w:tcW w:type="dxa" w:w="1560"/>
+          </w:tcPr>
+          <w:p>
+            <w:r>
+              <w:rPr>
+                <w:sz w:val="16"/>
+              </w:rPr>
+              <w:t>historical</w:t>
+            </w:r>
+          </w:p>
+        </w:tc>
+        <w:tc>
+          <w:tcPr>
+            <w:tcW w:type="dxa" w:w="1560"/>
+          </w:tcPr>
+          <w:p>
+            <w:r>
+              <w:rPr>
+                <w:sz w:val="16"/>
+              </w:rPr>
+              <w:t>22.7%</w:t>
+            </w:r>
+          </w:p>
+        </w:tc>
+        <w:tc>
+          <w:tcPr>
+            <w:tcW w:type="dxa" w:w="1560"/>
+          </w:tcPr>
+          <w:p>
+            <w:r>
+              <w:rPr>
+                <w:sz w:val="16"/>
+              </w:rPr>
+              <w:t>22.1%</w:t>
+            </w:r>
+          </w:p>
+        </w:tc>
+        <w:tc>
+          <w:tcPr>
+            <w:tcW w:type="dxa" w:w="1560"/>
+          </w:tcPr>
+          <w:p>
+            <w:r>
+              <w:rPr>
+                <w:sz w:val="16"/>
+              </w:rPr>
+            </w:r>
+          </w:p>
+        </w:tc>
+      </w:tr>
+      <w:tr>
+        <w:tc>
+          <w:tcPr>
+            <w:tcW w:type="dxa" w:w="1560"/>
+          </w:tcPr>
+          <w:p>
+            <w:r>
+              <w:rPr>
+                <w:sz w:val="16"/>
+              </w:rPr>
+              <w:t>Vladimir the Great</w:t>
+            </w:r>
+          </w:p>
+        </w:tc>
+        <w:tc>
+          <w:tcPr>
+            <w:tcW w:type="dxa" w:w="1560"/>
+          </w:tcPr>
+          <w:p>
+            <w:r>
+              <w:rPr>
+                <w:sz w:val="16"/>
+              </w:rPr>
+              <w:t>Volodymyr the Great</w:t>
+            </w:r>
+          </w:p>
+        </w:tc>
+        <w:tc>
+          <w:tcPr>
+            <w:tcW w:type="dxa" w:w="1560"/>
+          </w:tcPr>
+          <w:p>
+            <w:r>
+              <w:rPr>
+                <w:sz w:val="16"/>
+              </w:rPr>
+              <w:t>historical</w:t>
+            </w:r>
+          </w:p>
+        </w:tc>
+        <w:tc>
+          <w:tcPr>
+            <w:tcW w:type="dxa" w:w="1560"/>
+          </w:tcPr>
+          <w:p>
+            <w:r>
+              <w:rPr>
+                <w:sz w:val="16"/>
+              </w:rPr>
+              <w:t>4.8%</w:t>
+            </w:r>
+          </w:p>
+        </w:tc>
+        <w:tc>
+          <w:tcPr>
+            <w:tcW w:type="dxa" w:w="1560"/>
+          </w:tcPr>
+          <w:p>
+            <w:r>
+              <w:rPr>
+                <w:sz w:val="16"/>
+              </w:rPr>
+              <w:t>14.8%</w:t>
+            </w:r>
+          </w:p>
+        </w:tc>
+        <w:tc>
+          <w:tcPr>
+            <w:tcW w:type="dxa" w:w="1560"/>
+          </w:tcPr>
+          <w:p>
+            <w:r>
+              <w:rPr>
+                <w:sz w:val="16"/>
+              </w:rPr>
+              <w:t>★</w:t>
+            </w:r>
+          </w:p>
+        </w:tc>
+      </w:tr>
+      <w:tr>
+        <w:tc>
+          <w:tcPr>
+            <w:tcW w:type="dxa" w:w="1560"/>
+          </w:tcPr>
+          <w:p>
+            <w:r>
+              <w:rPr>
+                <w:sz w:val="16"/>
+              </w:rPr>
+              <w:t>Kiev National University</w:t>
+            </w:r>
+          </w:p>
+        </w:tc>
+        <w:tc>
+          <w:tcPr>
+            <w:tcW w:type="dxa" w:w="1560"/>
+          </w:tcPr>
+          <w:p>
+            <w:r>
+              <w:rPr>
+                <w:sz w:val="16"/>
+              </w:rPr>
+              <w:t>Kyiv National University</w:t>
+            </w:r>
+          </w:p>
+        </w:tc>
+        <w:tc>
+          <w:tcPr>
+            <w:tcW w:type="dxa" w:w="1560"/>
+          </w:tcPr>
+          <w:p>
+            <w:r>
+              <w:rPr>
+                <w:sz w:val="16"/>
+              </w:rPr>
+              <w:t>institutional</w:t>
+            </w:r>
+          </w:p>
+        </w:tc>
+        <w:tc>
+          <w:tcPr>
+            <w:tcW w:type="dxa" w:w="1560"/>
+          </w:tcPr>
+          <w:p>
+            <w:r>
+              <w:rPr>
+                <w:sz w:val="16"/>
+              </w:rPr>
+              <w:t>82.6%</w:t>
+            </w:r>
+          </w:p>
+        </w:tc>
+        <w:tc>
+          <w:tcPr>
+            <w:tcW w:type="dxa" w:w="1560"/>
+          </w:tcPr>
+          <w:p>
+            <w:r>
+              <w:rPr>
+                <w:sz w:val="16"/>
+              </w:rPr>
+              <w:t>77.1%</w:t>
+            </w:r>
+          </w:p>
+        </w:tc>
+        <w:tc>
+          <w:tcPr>
+            <w:tcW w:type="dxa" w:w="1560"/>
+          </w:tcPr>
+          <w:p>
+            <w:r>
+              <w:rPr>
+                <w:sz w:val="16"/>
+              </w:rPr>
+            </w:r>
+          </w:p>
+        </w:tc>
+      </w:tr>
+      <w:tr>
+        <w:tc>
+          <w:tcPr>
+            <w:tcW w:type="dxa" w:w="1560"/>
+          </w:tcPr>
+          <w:p>
+            <w:r>
+              <w:rPr>
+                <w:sz w:val="16"/>
+              </w:rPr>
+              <w:t>Lvov Polytechnic</w:t>
+            </w:r>
+          </w:p>
+        </w:tc>
+        <w:tc>
+          <w:tcPr>
+            <w:tcW w:type="dxa" w:w="1560"/>
+          </w:tcPr>
+          <w:p>
+            <w:r>
+              <w:rPr>
+                <w:sz w:val="16"/>
+              </w:rPr>
+              <w:t>Lviv Polytechnic</w:t>
+            </w:r>
+          </w:p>
+        </w:tc>
+        <w:tc>
+          <w:tcPr>
+            <w:tcW w:type="dxa" w:w="1560"/>
+          </w:tcPr>
+          <w:p>
+            <w:r>
+              <w:rPr>
+                <w:sz w:val="16"/>
+              </w:rPr>
+              <w:t>institutional</w:t>
+            </w:r>
+          </w:p>
+        </w:tc>
+        <w:tc>
+          <w:tcPr>
+            <w:tcW w:type="dxa" w:w="1560"/>
+          </w:tcPr>
+          <w:p>
+            <w:r>
+              <w:rPr>
+                <w:sz w:val="16"/>
+              </w:rPr>
+              <w:t>81.3%</w:t>
+            </w:r>
+          </w:p>
+        </w:tc>
+        <w:tc>
+          <w:tcPr>
+            <w:tcW w:type="dxa" w:w="1560"/>
+          </w:tcPr>
+          <w:p>
+            <w:r>
+              <w:rPr>
+                <w:sz w:val="16"/>
+              </w:rPr>
+              <w:t>94.1%</w:t>
+            </w:r>
+          </w:p>
+        </w:tc>
+        <w:tc>
+          <w:tcPr>
+            <w:tcW w:type="dxa" w:w="1560"/>
+          </w:tcPr>
+          <w:p>
+            <w:r>
+              <w:rPr>
+                <w:sz w:val="16"/>
+              </w:rPr>
+            </w:r>
+          </w:p>
+        </w:tc>
+      </w:tr>
+      <w:tr>
+        <w:tc>
+          <w:tcPr>
+            <w:tcW w:type="dxa" w:w="1560"/>
+          </w:tcPr>
+          <w:p>
+            <w:r>
+              <w:rPr>
+                <w:sz w:val="16"/>
+              </w:rPr>
+              <w:t>Kiev Polytechnic</w:t>
+            </w:r>
+          </w:p>
+        </w:tc>
+        <w:tc>
+          <w:tcPr>
+            <w:tcW w:type="dxa" w:w="1560"/>
+          </w:tcPr>
+          <w:p>
+            <w:r>
+              <w:rPr>
+                <w:sz w:val="16"/>
+              </w:rPr>
+              <w:t>Kyiv Polytechnic</w:t>
+            </w:r>
+          </w:p>
+        </w:tc>
+        <w:tc>
+          <w:tcPr>
+            <w:tcW w:type="dxa" w:w="1560"/>
+          </w:tcPr>
+          <w:p>
+            <w:r>
+              <w:rPr>
+                <w:sz w:val="16"/>
+              </w:rPr>
+              <w:t>institutional</w:t>
+            </w:r>
+          </w:p>
+        </w:tc>
+        <w:tc>
+          <w:tcPr>
+            <w:tcW w:type="dxa" w:w="1560"/>
+          </w:tcPr>
+          <w:p>
+            <w:r>
+              <w:rPr>
+                <w:sz w:val="16"/>
+              </w:rPr>
+              <w:t>78.3%</w:t>
+            </w:r>
+          </w:p>
+        </w:tc>
+        <w:tc>
+          <w:tcPr>
+            <w:tcW w:type="dxa" w:w="1560"/>
+          </w:tcPr>
+          <w:p>
+            <w:r>
+              <w:rPr>
+                <w:sz w:val="16"/>
+              </w:rPr>
+              <w:t>86.1%</w:t>
+            </w:r>
+          </w:p>
+        </w:tc>
+        <w:tc>
+          <w:tcPr>
+            <w:tcW w:type="dxa" w:w="1560"/>
+          </w:tcPr>
+          <w:p>
+            <w:r>
+              <w:rPr>
+                <w:sz w:val="16"/>
+              </w:rPr>
+            </w:r>
+          </w:p>
+        </w:tc>
+      </w:tr>
+      <w:tr>
+        <w:tc>
+          <w:tcPr>
+            <w:tcW w:type="dxa" w:w="1560"/>
+          </w:tcPr>
+          <w:p>
+            <w:r>
+              <w:rPr>
+                <w:sz w:val="16"/>
+              </w:rPr>
+              <w:t>Kharkov University</w:t>
+            </w:r>
+          </w:p>
+        </w:tc>
+        <w:tc>
+          <w:tcPr>
+            <w:tcW w:type="dxa" w:w="1560"/>
+          </w:tcPr>
+          <w:p>
+            <w:r>
+              <w:rPr>
+                <w:sz w:val="16"/>
+              </w:rPr>
+              <w:t>Kharkiv University</w:t>
+            </w:r>
+          </w:p>
+        </w:tc>
+        <w:tc>
+          <w:tcPr>
+            <w:tcW w:type="dxa" w:w="1560"/>
+          </w:tcPr>
+          <w:p>
+            <w:r>
+              <w:rPr>
+                <w:sz w:val="16"/>
+              </w:rPr>
+              <w:t>institutional</w:t>
+            </w:r>
+          </w:p>
+        </w:tc>
+        <w:tc>
+          <w:tcPr>
+            <w:tcW w:type="dxa" w:w="1560"/>
+          </w:tcPr>
+          <w:p>
+            <w:r>
+              <w:rPr>
+                <w:sz w:val="16"/>
+              </w:rPr>
+              <w:t>55.5%</w:t>
+            </w:r>
+          </w:p>
+        </w:tc>
+        <w:tc>
+          <w:tcPr>
+            <w:tcW w:type="dxa" w:w="1560"/>
+          </w:tcPr>
+          <w:p>
+            <w:r>
+              <w:rPr>
+                <w:sz w:val="16"/>
+              </w:rPr>
+              <w:t>68.9%</w:t>
+            </w:r>
+          </w:p>
+        </w:tc>
+        <w:tc>
+          <w:tcPr>
+            <w:tcW w:type="dxa" w:w="1560"/>
+          </w:tcPr>
+          <w:p>
+            <w:r>
+              <w:rPr>
+                <w:sz w:val="16"/>
+              </w:rPr>
+            </w:r>
+          </w:p>
+        </w:tc>
+      </w:tr>
+      <w:tr>
+        <w:tc>
+          <w:tcPr>
+            <w:tcW w:type="dxa" w:w="1560"/>
+          </w:tcPr>
+          <w:p>
+            <w:r>
+              <w:rPr>
+                <w:sz w:val="16"/>
+              </w:rPr>
+              <w:t>Kiev Patriarchate</w:t>
+            </w:r>
+          </w:p>
+        </w:tc>
+        <w:tc>
+          <w:tcPr>
+            <w:tcW w:type="dxa" w:w="1560"/>
+          </w:tcPr>
+          <w:p>
+            <w:r>
+              <w:rPr>
+                <w:sz w:val="16"/>
+              </w:rPr>
+              <w:t>Kyiv Patriarchate</w:t>
+            </w:r>
+          </w:p>
+        </w:tc>
+        <w:tc>
+          <w:tcPr>
+            <w:tcW w:type="dxa" w:w="1560"/>
+          </w:tcPr>
+          <w:p>
+            <w:r>
+              <w:rPr>
+                <w:sz w:val="16"/>
+              </w:rPr>
+              <w:t>institutional</w:t>
+            </w:r>
+          </w:p>
+        </w:tc>
+        <w:tc>
+          <w:tcPr>
+            <w:tcW w:type="dxa" w:w="1560"/>
+          </w:tcPr>
+          <w:p>
+            <w:r>
+              <w:rPr>
+                <w:sz w:val="16"/>
+              </w:rPr>
+              <w:t>53.3%</w:t>
+            </w:r>
+          </w:p>
+        </w:tc>
+        <w:tc>
+          <w:tcPr>
+            <w:tcW w:type="dxa" w:w="1560"/>
+          </w:tcPr>
+          <w:p>
+            <w:r>
+              <w:rPr>
+                <w:sz w:val="16"/>
+              </w:rPr>
+              <w:t>40.2%</w:t>
+            </w:r>
+          </w:p>
+        </w:tc>
+        <w:tc>
+          <w:tcPr>
+            <w:tcW w:type="dxa" w:w="1560"/>
+          </w:tcPr>
+          <w:p>
+            <w:r>
+              <w:rPr>
+                <w:sz w:val="16"/>
+              </w:rPr>
+            </w:r>
+          </w:p>
+        </w:tc>
+      </w:tr>
+      <w:tr>
+        <w:tc>
+          <w:tcPr>
+            <w:tcW w:type="dxa" w:w="1560"/>
+          </w:tcPr>
+          <w:p>
+            <w:r>
+              <w:rPr>
+                <w:sz w:val="16"/>
+              </w:rPr>
+              <w:t>Odessa National University</w:t>
+            </w:r>
+          </w:p>
+        </w:tc>
+        <w:tc>
+          <w:tcPr>
+            <w:tcW w:type="dxa" w:w="1560"/>
+          </w:tcPr>
+          <w:p>
+            <w:r>
+              <w:rPr>
+                <w:sz w:val="16"/>
+              </w:rPr>
+              <w:t>Odesa National University</w:t>
+            </w:r>
+          </w:p>
+        </w:tc>
+        <w:tc>
+          <w:tcPr>
+            <w:tcW w:type="dxa" w:w="1560"/>
+          </w:tcPr>
+          <w:p>
+            <w:r>
+              <w:rPr>
+                <w:sz w:val="16"/>
+              </w:rPr>
+              <w:t>institutional</w:t>
+            </w:r>
+          </w:p>
+        </w:tc>
+        <w:tc>
+          <w:tcPr>
+            <w:tcW w:type="dxa" w:w="1560"/>
+          </w:tcPr>
+          <w:p>
+            <w:r>
+              <w:rPr>
+                <w:sz w:val="16"/>
+              </w:rPr>
+              <w:t>23.2%</w:t>
+            </w:r>
+          </w:p>
+        </w:tc>
+        <w:tc>
+          <w:tcPr>
+            <w:tcW w:type="dxa" w:w="1560"/>
+          </w:tcPr>
+          <w:p>
+            <w:r>
+              <w:rPr>
+                <w:sz w:val="16"/>
+              </w:rPr>
+              <w:t>27.5%</w:t>
+            </w:r>
+          </w:p>
+        </w:tc>
+        <w:tc>
+          <w:tcPr>
+            <w:tcW w:type="dxa" w:w="1560"/>
+          </w:tcPr>
+          <w:p>
+            <w:r>
+              <w:rPr>
+                <w:sz w:val="16"/>
+              </w:rPr>
+            </w:r>
+          </w:p>
+        </w:tc>
+      </w:tr>
+      <w:tr>
+        <w:tc>
+          <w:tcPr>
+            <w:tcW w:type="dxa" w:w="1560"/>
+          </w:tcPr>
+          <w:p>
+            <w:r>
+              <w:rPr>
+                <w:sz w:val="16"/>
+              </w:rPr>
+              <w:t>Kiev Pechersk Lavra</w:t>
+            </w:r>
+          </w:p>
+        </w:tc>
+        <w:tc>
+          <w:tcPr>
+            <w:tcW w:type="dxa" w:w="1560"/>
+          </w:tcPr>
+          <w:p>
+            <w:r>
+              <w:rPr>
+                <w:sz w:val="16"/>
+              </w:rPr>
+              <w:t>Kyiv Pechersk Lavra</w:t>
+            </w:r>
+          </w:p>
+        </w:tc>
+        <w:tc>
+          <w:tcPr>
+            <w:tcW w:type="dxa" w:w="1560"/>
+          </w:tcPr>
+          <w:p>
+            <w:r>
+              <w:rPr>
+                <w:sz w:val="16"/>
+              </w:rPr>
+              <w:t>landmarks</w:t>
+            </w:r>
+          </w:p>
+        </w:tc>
+        <w:tc>
+          <w:tcPr>
+            <w:tcW w:type="dxa" w:w="1560"/>
+          </w:tcPr>
+          <w:p>
+            <w:r>
+              <w:rPr>
+                <w:sz w:val="16"/>
+              </w:rPr>
+              <w:t>74.7%</w:t>
+            </w:r>
+          </w:p>
+        </w:tc>
+        <w:tc>
+          <w:tcPr>
+            <w:tcW w:type="dxa" w:w="1560"/>
+          </w:tcPr>
+          <w:p>
+            <w:r>
+              <w:rPr>
+                <w:sz w:val="16"/>
+              </w:rPr>
+              <w:t>59.7%</w:t>
+            </w:r>
+          </w:p>
+        </w:tc>
+        <w:tc>
+          <w:tcPr>
+            <w:tcW w:type="dxa" w:w="1560"/>
+          </w:tcPr>
+          <w:p>
+            <w:r>
+              <w:rPr>
+                <w:sz w:val="16"/>
+              </w:rPr>
+            </w:r>
+          </w:p>
+        </w:tc>
+      </w:tr>
+      <w:tr>
+        <w:tc>
+          <w:tcPr>
+            <w:tcW w:type="dxa" w:w="1560"/>
+          </w:tcPr>
+          <w:p>
+            <w:r>
+              <w:rPr>
+                <w:sz w:val="16"/>
+              </w:rPr>
+              <w:t>Saint Sophia Cathedral Kiev</w:t>
+            </w:r>
+          </w:p>
+        </w:tc>
+        <w:tc>
+          <w:tcPr>
+            <w:tcW w:type="dxa" w:w="1560"/>
+          </w:tcPr>
+          <w:p>
+            <w:r>
+              <w:rPr>
+                <w:sz w:val="16"/>
+              </w:rPr>
+              <w:t>Saint Sophia Cathedral Kyiv</w:t>
+            </w:r>
+          </w:p>
+        </w:tc>
+        <w:tc>
+          <w:tcPr>
+            <w:tcW w:type="dxa" w:w="1560"/>
+          </w:tcPr>
+          <w:p>
+            <w:r>
+              <w:rPr>
+                <w:sz w:val="16"/>
+              </w:rPr>
+              <w:t>landmarks</w:t>
+            </w:r>
+          </w:p>
+        </w:tc>
+        <w:tc>
+          <w:tcPr>
+            <w:tcW w:type="dxa" w:w="1560"/>
+          </w:tcPr>
+          <w:p>
+            <w:r>
+              <w:rPr>
+                <w:sz w:val="16"/>
+              </w:rPr>
+              <w:t>71.7%</w:t>
+            </w:r>
+          </w:p>
+        </w:tc>
+        <w:tc>
+          <w:tcPr>
+            <w:tcW w:type="dxa" w:w="1560"/>
+          </w:tcPr>
+          <w:p>
+            <w:r>
+              <w:rPr>
+                <w:sz w:val="16"/>
+              </w:rPr>
+              <w:t>71.4%</w:t>
+            </w:r>
+          </w:p>
+        </w:tc>
+        <w:tc>
+          <w:tcPr>
+            <w:tcW w:type="dxa" w:w="1560"/>
+          </w:tcPr>
+          <w:p>
+            <w:r>
+              <w:rPr>
+                <w:sz w:val="16"/>
+              </w:rPr>
+            </w:r>
+          </w:p>
+        </w:tc>
+      </w:tr>
+      <w:tr>
+        <w:tc>
+          <w:tcPr>
+            <w:tcW w:type="dxa" w:w="1560"/>
+          </w:tcPr>
+          <w:p>
+            <w:r>
+              <w:rPr>
+                <w:sz w:val="16"/>
+              </w:rPr>
+              <w:t>Motherland Monument Kiev</w:t>
+            </w:r>
+          </w:p>
+        </w:tc>
+        <w:tc>
+          <w:tcPr>
+            <w:tcW w:type="dxa" w:w="1560"/>
+          </w:tcPr>
+          <w:p>
+            <w:r>
+              <w:rPr>
+                <w:sz w:val="16"/>
+              </w:rPr>
+              <w:t>Motherland Monument Kyiv</w:t>
+            </w:r>
+          </w:p>
+        </w:tc>
+        <w:tc>
+          <w:tcPr>
+            <w:tcW w:type="dxa" w:w="1560"/>
+          </w:tcPr>
+          <w:p>
+            <w:r>
+              <w:rPr>
+                <w:sz w:val="16"/>
+              </w:rPr>
+              <w:t>landmarks</w:t>
+            </w:r>
+          </w:p>
+        </w:tc>
+        <w:tc>
+          <w:tcPr>
+            <w:tcW w:type="dxa" w:w="1560"/>
+          </w:tcPr>
+          <w:p>
+            <w:r>
+              <w:rPr>
+                <w:sz w:val="16"/>
+              </w:rPr>
+              <w:t>64.8%</w:t>
+            </w:r>
+          </w:p>
+        </w:tc>
+        <w:tc>
+          <w:tcPr>
+            <w:tcW w:type="dxa" w:w="1560"/>
+          </w:tcPr>
+          <w:p>
+            <w:r>
+              <w:rPr>
+                <w:sz w:val="16"/>
+              </w:rPr>
+              <w:t>47.2%</w:t>
+            </w:r>
+          </w:p>
+        </w:tc>
+        <w:tc>
+          <w:tcPr>
+            <w:tcW w:type="dxa" w:w="1560"/>
+          </w:tcPr>
+          <w:p>
+            <w:r>
+              <w:rPr>
+                <w:sz w:val="16"/>
+              </w:rPr>
+            </w:r>
+          </w:p>
+        </w:tc>
+      </w:tr>
+      <w:tr>
+        <w:tc>
+          <w:tcPr>
+            <w:tcW w:type="dxa" w:w="1560"/>
+          </w:tcPr>
+          <w:p>
+            <w:r>
+              <w:rPr>
+                <w:sz w:val="16"/>
+              </w:rPr>
+              <w:t>Potemkin Stairs Odessa</w:t>
+            </w:r>
+          </w:p>
+        </w:tc>
+        <w:tc>
+          <w:tcPr>
+            <w:tcW w:type="dxa" w:w="1560"/>
+          </w:tcPr>
+          <w:p>
+            <w:r>
+              <w:rPr>
+                <w:sz w:val="16"/>
+              </w:rPr>
+              <w:t>Potemkin Stairs Odesa</w:t>
+            </w:r>
+          </w:p>
+        </w:tc>
+        <w:tc>
+          <w:tcPr>
+            <w:tcW w:type="dxa" w:w="1560"/>
+          </w:tcPr>
+          <w:p>
+            <w:r>
+              <w:rPr>
+                <w:sz w:val="16"/>
+              </w:rPr>
+              <w:t>landmarks</w:t>
+            </w:r>
+          </w:p>
+        </w:tc>
+        <w:tc>
+          <w:tcPr>
+            <w:tcW w:type="dxa" w:w="1560"/>
+          </w:tcPr>
+          <w:p>
+            <w:r>
+              <w:rPr>
+                <w:sz w:val="16"/>
+              </w:rPr>
+              <w:t>39.0%</w:t>
+            </w:r>
+          </w:p>
+        </w:tc>
+        <w:tc>
+          <w:tcPr>
+            <w:tcW w:type="dxa" w:w="1560"/>
+          </w:tcPr>
+          <w:p>
+            <w:r>
+              <w:rPr>
+                <w:sz w:val="16"/>
+              </w:rPr>
+              <w:t>38.2%</w:t>
+            </w:r>
+          </w:p>
+        </w:tc>
+        <w:tc>
+          <w:tcPr>
+            <w:tcW w:type="dxa" w:w="1560"/>
+          </w:tcPr>
+          <w:p>
+            <w:r>
+              <w:rPr>
+                <w:sz w:val="16"/>
+              </w:rPr>
+            </w:r>
+          </w:p>
+        </w:tc>
+      </w:tr>
+      <w:tr>
+        <w:tc>
+          <w:tcPr>
+            <w:tcW w:type="dxa" w:w="1560"/>
+          </w:tcPr>
+          <w:p>
+            <w:r>
+              <w:rPr>
+                <w:sz w:val="16"/>
+              </w:rPr>
+              <w:t>Babi Yar</w:t>
+            </w:r>
+          </w:p>
+        </w:tc>
+        <w:tc>
+          <w:tcPr>
+            <w:tcW w:type="dxa" w:w="1560"/>
+          </w:tcPr>
+          <w:p>
+            <w:r>
+              <w:rPr>
+                <w:sz w:val="16"/>
+              </w:rPr>
+              <w:t>Babyn Yar</w:t>
+            </w:r>
+          </w:p>
+        </w:tc>
+        <w:tc>
+          <w:tcPr>
+            <w:tcW w:type="dxa" w:w="1560"/>
+          </w:tcPr>
+          <w:p>
+            <w:r>
+              <w:rPr>
+                <w:sz w:val="16"/>
+              </w:rPr>
+              <w:t>landmarks</w:t>
+            </w:r>
+          </w:p>
+        </w:tc>
+        <w:tc>
+          <w:tcPr>
+            <w:tcW w:type="dxa" w:w="1560"/>
+          </w:tcPr>
+          <w:p>
+            <w:r>
+              <w:rPr>
+                <w:sz w:val="16"/>
+              </w:rPr>
+              <w:t>35.6%</w:t>
+            </w:r>
+          </w:p>
+        </w:tc>
+        <w:tc>
+          <w:tcPr>
+            <w:tcW w:type="dxa" w:w="1560"/>
+          </w:tcPr>
+          <w:p>
+            <w:r>
+              <w:rPr>
+                <w:sz w:val="16"/>
+              </w:rPr>
+              <w:t>32.0%</w:t>
+            </w:r>
+          </w:p>
+        </w:tc>
+        <w:tc>
+          <w:tcPr>
+            <w:tcW w:type="dxa" w:w="1560"/>
+          </w:tcPr>
+          <w:p>
+            <w:r>
+              <w:rPr>
+                <w:sz w:val="16"/>
+              </w:rPr>
+            </w:r>
+          </w:p>
+        </w:tc>
+      </w:tr>
+      <w:tr>
+        <w:tc>
+          <w:tcPr>
+            <w:tcW w:type="dxa" w:w="1560"/>
+          </w:tcPr>
+          <w:p>
+            <w:r>
+              <w:rPr>
+                <w:sz w:val="16"/>
+              </w:rPr>
+              <w:t>Chernobyl Exclusion Zone</w:t>
+            </w:r>
+          </w:p>
+        </w:tc>
+        <w:tc>
+          <w:tcPr>
+            <w:tcW w:type="dxa" w:w="1560"/>
+          </w:tcPr>
+          <w:p>
+            <w:r>
+              <w:rPr>
+                <w:sz w:val="16"/>
+              </w:rPr>
+              <w:t>Chornobyl Exclusion Zone</w:t>
+            </w:r>
+          </w:p>
+        </w:tc>
+        <w:tc>
+          <w:tcPr>
+            <w:tcW w:type="dxa" w:w="1560"/>
+          </w:tcPr>
+          <w:p>
+            <w:r>
+              <w:rPr>
+                <w:sz w:val="16"/>
+              </w:rPr>
+              <w:t>landmarks</w:t>
+            </w:r>
+          </w:p>
+        </w:tc>
+        <w:tc>
+          <w:tcPr>
+            <w:tcW w:type="dxa" w:w="1560"/>
+          </w:tcPr>
+          <w:p>
+            <w:r>
+              <w:rPr>
+                <w:sz w:val="16"/>
+              </w:rPr>
+              <w:t>21.9%</w:t>
+            </w:r>
+          </w:p>
+        </w:tc>
+        <w:tc>
+          <w:tcPr>
+            <w:tcW w:type="dxa" w:w="1560"/>
+          </w:tcPr>
+          <w:p>
+            <w:r>
+              <w:rPr>
+                <w:sz w:val="16"/>
+              </w:rPr>
+              <w:t>23.1%</w:t>
+            </w:r>
+          </w:p>
+        </w:tc>
+        <w:tc>
+          <w:tcPr>
+            <w:tcW w:type="dxa" w:w="1560"/>
+          </w:tcPr>
+          <w:p>
+            <w:r>
+              <w:rPr>
+                <w:sz w:val="16"/>
+              </w:rPr>
+            </w:r>
+          </w:p>
+        </w:tc>
+      </w:tr>
+      <w:tr>
+        <w:tc>
+          <w:tcPr>
+            <w:tcW w:type="dxa" w:w="1560"/>
+          </w:tcPr>
+          <w:p>
+            <w:r>
+              <w:rPr>
+                <w:sz w:val="16"/>
+              </w:rPr>
+              <w:t>Alexander Usyk</w:t>
+            </w:r>
+          </w:p>
+        </w:tc>
+        <w:tc>
+          <w:tcPr>
+            <w:tcW w:type="dxa" w:w="1560"/>
+          </w:tcPr>
+          <w:p>
+            <w:r>
+              <w:rPr>
+                <w:sz w:val="16"/>
+              </w:rPr>
+              <w:t>Oleksandr Usyk</w:t>
+            </w:r>
+          </w:p>
+        </w:tc>
+        <w:tc>
+          <w:tcPr>
+            <w:tcW w:type="dxa" w:w="1560"/>
+          </w:tcPr>
+          <w:p>
+            <w:r>
+              <w:rPr>
+                <w:sz w:val="16"/>
+              </w:rPr>
+              <w:t>people</w:t>
+            </w:r>
+          </w:p>
+        </w:tc>
+        <w:tc>
+          <w:tcPr>
+            <w:tcW w:type="dxa" w:w="1560"/>
+          </w:tcPr>
+          <w:p>
+            <w:r>
+              <w:rPr>
+                <w:sz w:val="16"/>
+              </w:rPr>
+              <w:t>69.9%</w:t>
+            </w:r>
+          </w:p>
+        </w:tc>
+        <w:tc>
+          <w:tcPr>
+            <w:tcW w:type="dxa" w:w="1560"/>
+          </w:tcPr>
+          <w:p>
+            <w:r>
+              <w:rPr>
+                <w:sz w:val="16"/>
+              </w:rPr>
+              <w:t>76.9%</w:t>
+            </w:r>
+          </w:p>
+        </w:tc>
+        <w:tc>
+          <w:tcPr>
+            <w:tcW w:type="dxa" w:w="1560"/>
+          </w:tcPr>
+          <w:p>
+            <w:r>
+              <w:rPr>
+                <w:sz w:val="16"/>
+              </w:rPr>
+            </w:r>
+          </w:p>
+        </w:tc>
+      </w:tr>
+      <w:tr>
+        <w:tc>
+          <w:tcPr>
+            <w:tcW w:type="dxa" w:w="1560"/>
+          </w:tcPr>
+          <w:p>
+            <w:r>
+              <w:rPr>
+                <w:sz w:val="16"/>
+              </w:rPr>
+              <w:t>Vladimir Zelensky</w:t>
+            </w:r>
+          </w:p>
+        </w:tc>
+        <w:tc>
+          <w:tcPr>
+            <w:tcW w:type="dxa" w:w="1560"/>
+          </w:tcPr>
+          <w:p>
+            <w:r>
+              <w:rPr>
+                <w:sz w:val="16"/>
+              </w:rPr>
+              <w:t>Volodymyr Zelenskyy</w:t>
+            </w:r>
+          </w:p>
+        </w:tc>
+        <w:tc>
+          <w:tcPr>
+            <w:tcW w:type="dxa" w:w="1560"/>
+          </w:tcPr>
+          <w:p>
+            <w:r>
+              <w:rPr>
+                <w:sz w:val="16"/>
+              </w:rPr>
+              <w:t>people</w:t>
+            </w:r>
+          </w:p>
+        </w:tc>
+        <w:tc>
+          <w:tcPr>
+            <w:tcW w:type="dxa" w:w="1560"/>
+          </w:tcPr>
+          <w:p>
+            <w:r>
+              <w:rPr>
+                <w:sz w:val="16"/>
+              </w:rPr>
+              <w:t>57.4%</w:t>
+            </w:r>
+          </w:p>
+        </w:tc>
+        <w:tc>
+          <w:tcPr>
+            <w:tcW w:type="dxa" w:w="1560"/>
+          </w:tcPr>
+          <w:p>
+            <w:r>
+              <w:rPr>
+                <w:sz w:val="16"/>
+              </w:rPr>
+              <w:t>54.6%</w:t>
+            </w:r>
+          </w:p>
+        </w:tc>
+        <w:tc>
+          <w:tcPr>
+            <w:tcW w:type="dxa" w:w="1560"/>
+          </w:tcPr>
+          <w:p>
+            <w:r>
+              <w:rPr>
+                <w:sz w:val="16"/>
+              </w:rPr>
+              <w:t>★</w:t>
+            </w:r>
+          </w:p>
+        </w:tc>
+      </w:tr>
+      <w:tr>
+        <w:tc>
+          <w:tcPr>
+            <w:tcW w:type="dxa" w:w="1560"/>
+          </w:tcPr>
+          <w:p>
+            <w:r>
+              <w:rPr>
+                <w:sz w:val="16"/>
+              </w:rPr>
+              <w:t>Metalist Kharkov</w:t>
+            </w:r>
+          </w:p>
+        </w:tc>
+        <w:tc>
+          <w:tcPr>
+            <w:tcW w:type="dxa" w:w="1560"/>
+          </w:tcPr>
+          <w:p>
+            <w:r>
+              <w:rPr>
+                <w:sz w:val="16"/>
+              </w:rPr>
+              <w:t>Metalist Kharkiv</w:t>
+            </w:r>
+          </w:p>
+        </w:tc>
+        <w:tc>
+          <w:tcPr>
+            <w:tcW w:type="dxa" w:w="1560"/>
+          </w:tcPr>
+          <w:p>
+            <w:r>
+              <w:rPr>
+                <w:sz w:val="16"/>
+              </w:rPr>
+              <w:t>sports</w:t>
+            </w:r>
+          </w:p>
+        </w:tc>
+        <w:tc>
+          <w:tcPr>
+            <w:tcW w:type="dxa" w:w="1560"/>
+          </w:tcPr>
+          <w:p>
+            <w:r>
+              <w:rPr>
+                <w:sz w:val="16"/>
+              </w:rPr>
+              <w:t>80.7%</w:t>
+            </w:r>
+          </w:p>
+        </w:tc>
+        <w:tc>
+          <w:tcPr>
+            <w:tcW w:type="dxa" w:w="1560"/>
+          </w:tcPr>
+          <w:p>
+            <w:r>
+              <w:rPr>
+                <w:sz w:val="16"/>
+              </w:rPr>
+              <w:t>81.2%</w:t>
+            </w:r>
+          </w:p>
+        </w:tc>
+        <w:tc>
+          <w:tcPr>
+            <w:tcW w:type="dxa" w:w="1560"/>
+          </w:tcPr>
+          <w:p>
+            <w:r>
+              <w:rPr>
+                <w:sz w:val="16"/>
+              </w:rPr>
+            </w:r>
+          </w:p>
+        </w:tc>
+      </w:tr>
+      <w:tr>
+        <w:tc>
+          <w:tcPr>
+            <w:tcW w:type="dxa" w:w="1560"/>
+          </w:tcPr>
+          <w:p>
+            <w:r>
+              <w:rPr>
+                <w:sz w:val="16"/>
+              </w:rPr>
+              <w:t>Karpaty Lvov</w:t>
+            </w:r>
+          </w:p>
+        </w:tc>
+        <w:tc>
+          <w:tcPr>
+            <w:tcW w:type="dxa" w:w="1560"/>
+          </w:tcPr>
+          <w:p>
+            <w:r>
+              <w:rPr>
+                <w:sz w:val="16"/>
+              </w:rPr>
+              <w:t>Karpaty Lviv</w:t>
+            </w:r>
+          </w:p>
+        </w:tc>
+        <w:tc>
+          <w:tcPr>
+            <w:tcW w:type="dxa" w:w="1560"/>
+          </w:tcPr>
+          <w:p>
+            <w:r>
+              <w:rPr>
+                <w:sz w:val="16"/>
+              </w:rPr>
+              <w:t>sports</w:t>
+            </w:r>
+          </w:p>
+        </w:tc>
+        <w:tc>
+          <w:tcPr>
+            <w:tcW w:type="dxa" w:w="1560"/>
+          </w:tcPr>
+          <w:p>
+            <w:r>
+              <w:rPr>
+                <w:sz w:val="16"/>
+              </w:rPr>
+              <w:t>73.3%</w:t>
+            </w:r>
+          </w:p>
+        </w:tc>
+        <w:tc>
+          <w:tcPr>
+            <w:tcW w:type="dxa" w:w="1560"/>
+          </w:tcPr>
+          <w:p>
+            <w:r>
+              <w:rPr>
+                <w:sz w:val="16"/>
+              </w:rPr>
+              <w:t>82.1%</w:t>
+            </w:r>
+          </w:p>
+        </w:tc>
+        <w:tc>
+          <w:tcPr>
+            <w:tcW w:type="dxa" w:w="1560"/>
+          </w:tcPr>
+          <w:p>
+            <w:r>
+              <w:rPr>
+                <w:sz w:val="16"/>
+              </w:rPr>
+            </w:r>
+          </w:p>
+        </w:tc>
+      </w:tr>
+      <w:tr>
+        <w:tc>
+          <w:tcPr>
+            <w:tcW w:type="dxa" w:w="1560"/>
+          </w:tcPr>
+          <w:p>
+            <w:r>
+              <w:rPr>
+                <w:sz w:val="16"/>
+              </w:rPr>
+              <w:t>Dynamo Kiev</w:t>
+            </w:r>
+          </w:p>
+        </w:tc>
+        <w:tc>
+          <w:tcPr>
+            <w:tcW w:type="dxa" w:w="1560"/>
+          </w:tcPr>
+          <w:p>
+            <w:r>
+              <w:rPr>
+                <w:sz w:val="16"/>
+              </w:rPr>
+              <w:t>Dynamo Kyiv</w:t>
+            </w:r>
+          </w:p>
+        </w:tc>
+        <w:tc>
+          <w:tcPr>
+            <w:tcW w:type="dxa" w:w="1560"/>
+          </w:tcPr>
+          <w:p>
+            <w:r>
+              <w:rPr>
+                <w:sz w:val="16"/>
+              </w:rPr>
+              <w:t>sports</w:t>
+            </w:r>
+          </w:p>
+        </w:tc>
+        <w:tc>
+          <w:tcPr>
+            <w:tcW w:type="dxa" w:w="1560"/>
+          </w:tcPr>
+          <w:p>
+            <w:r>
+              <w:rPr>
+                <w:sz w:val="16"/>
+              </w:rPr>
+              <w:t>71.0%</w:t>
+            </w:r>
+          </w:p>
+        </w:tc>
+        <w:tc>
+          <w:tcPr>
+            <w:tcW w:type="dxa" w:w="1560"/>
+          </w:tcPr>
+          <w:p>
+            <w:r>
+              <w:rPr>
+                <w:sz w:val="16"/>
+              </w:rPr>
+              <w:t>56.3%</w:t>
+            </w:r>
+          </w:p>
+        </w:tc>
+        <w:tc>
+          <w:tcPr>
+            <w:tcW w:type="dxa" w:w="1560"/>
+          </w:tcPr>
+          <w:p>
+            <w:r>
+              <w:rPr>
+                <w:sz w:val="16"/>
+              </w:rPr>
+            </w:r>
+          </w:p>
+        </w:tc>
+      </w:tr>
+      <w:tr>
+        <w:tc>
+          <w:tcPr>
+            <w:tcW w:type="dxa" w:w="1560"/>
+          </w:tcPr>
+          <w:p>
+            <w:r>
+              <w:rPr>
+                <w:sz w:val="16"/>
+              </w:rPr>
+              <w:t>Kiev ballet</w:t>
+            </w:r>
+          </w:p>
+        </w:tc>
+        <w:tc>
+          <w:tcPr>
+            <w:tcW w:type="dxa" w:w="1560"/>
+          </w:tcPr>
+          <w:p>
+            <w:r>
+              <w:rPr>
+                <w:sz w:val="16"/>
+              </w:rPr>
+              <w:t>Kyiv ballet</w:t>
+            </w:r>
+          </w:p>
+        </w:tc>
+        <w:tc>
+          <w:tcPr>
+            <w:tcW w:type="dxa" w:w="1560"/>
+          </w:tcPr>
+          <w:p>
+            <w:r>
+              <w:rPr>
+                <w:sz w:val="16"/>
+              </w:rPr>
+              <w:t>sports</w:t>
+            </w:r>
+          </w:p>
+        </w:tc>
+        <w:tc>
+          <w:tcPr>
+            <w:tcW w:type="dxa" w:w="1560"/>
+          </w:tcPr>
+          <w:p>
+            <w:r>
+              <w:rPr>
+                <w:sz w:val="16"/>
+              </w:rPr>
+              <w:t>65.5%</w:t>
+            </w:r>
+          </w:p>
+        </w:tc>
+        <w:tc>
+          <w:tcPr>
+            <w:tcW w:type="dxa" w:w="1560"/>
+          </w:tcPr>
+          <w:p>
+            <w:r>
+              <w:rPr>
+                <w:sz w:val="16"/>
+              </w:rPr>
+              <w:t>58.9%</w:t>
+            </w:r>
+          </w:p>
+        </w:tc>
+        <w:tc>
+          <w:tcPr>
+            <w:tcW w:type="dxa" w:w="1560"/>
+          </w:tcPr>
+          <w:p>
+            <w:r>
+              <w:rPr>
+                <w:sz w:val="16"/>
+              </w:rPr>
+            </w:r>
+          </w:p>
+        </w:tc>
+      </w:tr>
+      <w:tr>
+        <w:tc>
+          <w:tcPr>
+            <w:tcW w:type="dxa" w:w="1560"/>
+          </w:tcPr>
+          <w:p>
+            <w:r>
+              <w:rPr>
+                <w:sz w:val="16"/>
+              </w:rPr>
+              <w:t>Zorya Lugansk</w:t>
+            </w:r>
+          </w:p>
+        </w:tc>
+        <w:tc>
+          <w:tcPr>
+            <w:tcW w:type="dxa" w:w="1560"/>
+          </w:tcPr>
+          <w:p>
+            <w:r>
+              <w:rPr>
+                <w:sz w:val="16"/>
+              </w:rPr>
+              <w:t>Zorya Luhansk</w:t>
+            </w:r>
+          </w:p>
+        </w:tc>
+        <w:tc>
+          <w:tcPr>
+            <w:tcW w:type="dxa" w:w="1560"/>
+          </w:tcPr>
+          <w:p>
+            <w:r>
+              <w:rPr>
+                <w:sz w:val="16"/>
+              </w:rPr>
+              <w:t>sports</w:t>
+            </w:r>
+          </w:p>
+        </w:tc>
+        <w:tc>
+          <w:tcPr>
+            <w:tcW w:type="dxa" w:w="1560"/>
+          </w:tcPr>
+          <w:p>
+            <w:r>
+              <w:rPr>
+                <w:sz w:val="16"/>
+              </w:rPr>
+              <w:t>65.3%</w:t>
+            </w:r>
+          </w:p>
+        </w:tc>
+        <w:tc>
+          <w:tcPr>
+            <w:tcW w:type="dxa" w:w="1560"/>
+          </w:tcPr>
+          <w:p>
+            <w:r>
+              <w:rPr>
+                <w:sz w:val="16"/>
+              </w:rPr>
+              <w:t>68.8%</w:t>
+            </w:r>
+          </w:p>
+        </w:tc>
+        <w:tc>
+          <w:tcPr>
+            <w:tcW w:type="dxa" w:w="1560"/>
+          </w:tcPr>
+          <w:p>
+            <w:r>
+              <w:rPr>
+                <w:sz w:val="16"/>
+              </w:rPr>
+            </w:r>
+          </w:p>
+        </w:tc>
+      </w:tr>
+    </w:tbl>
+    <w:p/>
+    <w:p>
+      <w:r>
+        <w:rPr>
+          <w:i/>
+          <w:sz w:val="18"/>
+        </w:rPr>
+        <w:t>Note: Adoption = mean of per-source UA/(UA+RU) ratios, equal-weighted across sources with sufficient data (GDELT ≥10, Trends ≥5, others ≥3).</w:t>
+      </w:r>
+    </w:p>
     <w:sectPr>
       <w:pgSz w:w="12240" w:h="15840"/>
       <w:pgMar w:top="1440" w:right="1440" w:bottom="1440" w:left="1440" w:header="720" w:footer="720" w:gutter="0"/>

</xml_diff>